<commit_message>
docs: order the letter table columns physically so Word and LibreOffice agree
</commit_message>
<xml_diff>
--- a/docs/list.docx
+++ b/docs/list.docx
@@ -2798,9 +2798,8 @@
     <w:tbl>
       <w:tblPr>
         <w:tblStyle w:val="Table1"/>
-        <w:bidiVisual w:val="1"/>
         <w:tblW w:w="10204" w:type="dxa"/>
-        <w:jc w:val="right"/>
+        <w:jc w:val="left"/>
         <w:tblBorders>
           <w:top w:color="000000" w:space="0" w:sz="8" w:val="single"/>
           <w:left w:color="000000" w:space="0" w:sz="8" w:val="single"/>
@@ -2813,13 +2812,13 @@
         <w:tblLook w:val="0600"/>
       </w:tblPr>
       <w:tblGrid>
+        <w:gridCol w:w="1575"/>
+        <w:gridCol w:w="1020"/>
+        <w:gridCol w:w="2194"/>
+        <w:gridCol w:w="1575"/>
+        <w:gridCol w:w="1020"/>
+        <w:gridCol w:w="2200"/>
         <w:gridCol w:w="620"/>
-        <w:gridCol w:w="2200"/>
-        <w:gridCol w:w="1020"/>
-        <w:gridCol w:w="1575"/>
-        <w:gridCol w:w="2194"/>
-        <w:gridCol w:w="1020"/>
-        <w:gridCol w:w="1575"/>
       </w:tblGrid>
       <w:tr>
         <w:trPr>
@@ -2846,22 +2845,8 @@
                 <w:szCs w:val="20"/>
                 <w:rtl w:val="1"/>
               </w:rPr>
-              <w:t xml:space="preserve">ز</w:t>
+              <w:t xml:space="preserve">ناوی</w:t>
             </w:r>
-          </w:p>
-        </w:tc>
-        <w:tc>
-          <w:tcPr/>
-          <w:p>
-            <w:pPr>
-              <w:bidi w:val="1"/>
-              <w:jc w:val="center"/>
-              <w:rPr>
-                <w:rFonts w:ascii="Noto Naskh Arabic" w:cs="Noto Naskh Arabic" w:eastAsia="Noto Naskh Arabic" w:hAnsi="Noto Naskh Arabic"/>
-                <w:sz w:val="20"/>
-                <w:szCs w:val="20"/>
-              </w:rPr>
-            </w:pPr>
             <w:r>
               <w:rPr>
                 <w:rFonts w:ascii="Noto Naskh Arabic" w:cs="Noto Naskh Arabic" w:eastAsia="Noto Naskh Arabic" w:hAnsi="Noto Naskh Arabic"/>
@@ -2869,7 +2854,16 @@
                 <w:szCs w:val="20"/>
                 <w:rtl w:val="1"/>
               </w:rPr>
-              <w:t xml:space="preserve">ناو</w:t>
+              <w:t xml:space="preserve"> </w:t>
+            </w:r>
+            <w:r>
+              <w:rPr>
+                <w:rFonts w:ascii="Noto Naskh Arabic" w:cs="Noto Naskh Arabic" w:eastAsia="Noto Naskh Arabic" w:hAnsi="Noto Naskh Arabic"/>
+                <w:sz w:val="20"/>
+                <w:szCs w:val="20"/>
+                <w:rtl w:val="1"/>
+              </w:rPr>
+              <w:t xml:space="preserve">دایک</w:t>
             </w:r>
           </w:p>
         </w:tc>
@@ -2893,6 +2887,29 @@
                 <w:rtl w:val="1"/>
               </w:rPr>
               <w:t xml:space="preserve">لەدایکبوون</w:t>
+            </w:r>
+          </w:p>
+        </w:tc>
+        <w:tc>
+          <w:tcPr/>
+          <w:p>
+            <w:pPr>
+              <w:bidi w:val="1"/>
+              <w:jc w:val="center"/>
+              <w:rPr>
+                <w:rFonts w:ascii="Noto Naskh Arabic" w:cs="Noto Naskh Arabic" w:eastAsia="Noto Naskh Arabic" w:hAnsi="Noto Naskh Arabic"/>
+                <w:sz w:val="20"/>
+                <w:szCs w:val="20"/>
+              </w:rPr>
+            </w:pPr>
+            <w:r>
+              <w:rPr>
+                <w:rFonts w:ascii="Noto Naskh Arabic" w:cs="Noto Naskh Arabic" w:eastAsia="Noto Naskh Arabic" w:hAnsi="Noto Naskh Arabic"/>
+                <w:sz w:val="20"/>
+                <w:szCs w:val="20"/>
+                <w:rtl w:val="1"/>
+              </w:rPr>
+              <w:t xml:space="preserve">هﺎوﺳﻪر</w:t>
             </w:r>
           </w:p>
         </w:tc>
@@ -2956,29 +2973,6 @@
                 <w:szCs w:val="20"/>
                 <w:rtl w:val="1"/>
               </w:rPr>
-              <w:t xml:space="preserve">هﺎوﺳﻪر</w:t>
-            </w:r>
-          </w:p>
-        </w:tc>
-        <w:tc>
-          <w:tcPr/>
-          <w:p>
-            <w:pPr>
-              <w:bidi w:val="1"/>
-              <w:jc w:val="center"/>
-              <w:rPr>
-                <w:rFonts w:ascii="Noto Naskh Arabic" w:cs="Noto Naskh Arabic" w:eastAsia="Noto Naskh Arabic" w:hAnsi="Noto Naskh Arabic"/>
-                <w:sz w:val="20"/>
-                <w:szCs w:val="20"/>
-              </w:rPr>
-            </w:pPr>
-            <w:r>
-              <w:rPr>
-                <w:rFonts w:ascii="Noto Naskh Arabic" w:cs="Noto Naskh Arabic" w:eastAsia="Noto Naskh Arabic" w:hAnsi="Noto Naskh Arabic"/>
-                <w:sz w:val="20"/>
-                <w:szCs w:val="20"/>
-                <w:rtl w:val="1"/>
-              </w:rPr>
               <w:t xml:space="preserve">لەدایکبوون</w:t>
             </w:r>
           </w:p>
@@ -3002,8 +2996,22 @@
                 <w:szCs w:val="20"/>
                 <w:rtl w:val="1"/>
               </w:rPr>
-              <w:t xml:space="preserve">ناوی</w:t>
+              <w:t xml:space="preserve">ناو</w:t>
             </w:r>
+          </w:p>
+        </w:tc>
+        <w:tc>
+          <w:tcPr/>
+          <w:p>
+            <w:pPr>
+              <w:bidi w:val="1"/>
+              <w:jc w:val="center"/>
+              <w:rPr>
+                <w:rFonts w:ascii="Noto Naskh Arabic" w:cs="Noto Naskh Arabic" w:eastAsia="Noto Naskh Arabic" w:hAnsi="Noto Naskh Arabic"/>
+                <w:sz w:val="20"/>
+                <w:szCs w:val="20"/>
+              </w:rPr>
+            </w:pPr>
             <w:r>
               <w:rPr>
                 <w:rFonts w:ascii="Noto Naskh Arabic" w:cs="Noto Naskh Arabic" w:eastAsia="Noto Naskh Arabic" w:hAnsi="Noto Naskh Arabic"/>
@@ -3011,16 +3019,7 @@
                 <w:szCs w:val="20"/>
                 <w:rtl w:val="1"/>
               </w:rPr>
-              <w:t xml:space="preserve"> </w:t>
-            </w:r>
-            <w:r>
-              <w:rPr>
-                <w:rFonts w:ascii="Noto Naskh Arabic" w:cs="Noto Naskh Arabic" w:eastAsia="Noto Naskh Arabic" w:hAnsi="Noto Naskh Arabic"/>
-                <w:sz w:val="20"/>
-                <w:szCs w:val="20"/>
-                <w:rtl w:val="1"/>
-              </w:rPr>
-              <w:t xml:space="preserve">دایک</w:t>
+              <w:t xml:space="preserve">ز</w:t>
             </w:r>
           </w:p>
         </w:tc>
@@ -3036,7 +3035,6 @@
           <w:p>
             <w:pPr>
               <w:widowControl w:val="0"/>
-              <w:bidi w:val="1"/>
               <w:rPr>
                 <w:rFonts w:ascii="Noto Naskh Arabic" w:cs="Noto Naskh Arabic" w:eastAsia="Noto Naskh Arabic" w:hAnsi="Noto Naskh Arabic"/>
                 <w:sz w:val="20"/>
@@ -3169,6 +3167,7 @@
           <w:p>
             <w:pPr>
               <w:widowControl w:val="0"/>
+              <w:bidi w:val="1"/>
               <w:rPr>
                 <w:rFonts w:ascii="Noto Naskh Arabic" w:cs="Noto Naskh Arabic" w:eastAsia="Noto Naskh Arabic" w:hAnsi="Noto Naskh Arabic"/>
                 <w:sz w:val="20"/>
@@ -3198,7 +3197,6 @@
           <w:p>
             <w:pPr>
               <w:widowControl w:val="0"/>
-              <w:bidi w:val="1"/>
               <w:rPr>
                 <w:rFonts w:ascii="Noto Naskh Arabic" w:cs="Noto Naskh Arabic" w:eastAsia="Noto Naskh Arabic" w:hAnsi="Noto Naskh Arabic"/>
                 <w:sz w:val="20"/>
@@ -3212,7 +3210,7 @@
                 <w:szCs w:val="20"/>
                 <w:rtl w:val="0"/>
               </w:rPr>
-              <w:t xml:space="preserve">{{ r.n }}</w:t>
+              <w:t xml:space="preserve">{{ r.spouse_mother_name }}</w:t>
             </w:r>
           </w:p>
         </w:tc>
@@ -3234,7 +3232,51 @@
                 <w:szCs w:val="20"/>
                 <w:rtl w:val="0"/>
               </w:rPr>
-              <w:t xml:space="preserve">{{ r.full_name }}</w:t>
+              <w:t xml:space="preserve">{{ r.spouse_year }}</w:t>
+            </w:r>
+          </w:p>
+        </w:tc>
+        <w:tc>
+          <w:tcPr/>
+          <w:p>
+            <w:pPr>
+              <w:widowControl w:val="0"/>
+              <w:rPr>
+                <w:rFonts w:ascii="Noto Naskh Arabic" w:cs="Noto Naskh Arabic" w:eastAsia="Noto Naskh Arabic" w:hAnsi="Noto Naskh Arabic"/>
+                <w:sz w:val="20"/>
+                <w:szCs w:val="20"/>
+              </w:rPr>
+            </w:pPr>
+            <w:r>
+              <w:rPr>
+                <w:rFonts w:ascii="Noto Naskh Arabic" w:cs="Noto Naskh Arabic" w:eastAsia="Noto Naskh Arabic" w:hAnsi="Noto Naskh Arabic"/>
+                <w:sz w:val="20"/>
+                <w:szCs w:val="20"/>
+                <w:rtl w:val="0"/>
+              </w:rPr>
+              <w:t xml:space="preserve">{{ r.spouse_name }}</w:t>
+            </w:r>
+          </w:p>
+        </w:tc>
+        <w:tc>
+          <w:tcPr/>
+          <w:p>
+            <w:pPr>
+              <w:widowControl w:val="0"/>
+              <w:rPr>
+                <w:rFonts w:ascii="Noto Naskh Arabic" w:cs="Noto Naskh Arabic" w:eastAsia="Noto Naskh Arabic" w:hAnsi="Noto Naskh Arabic"/>
+                <w:sz w:val="20"/>
+                <w:szCs w:val="20"/>
+              </w:rPr>
+            </w:pPr>
+            <w:r>
+              <w:rPr>
+                <w:rFonts w:ascii="Noto Naskh Arabic" w:cs="Noto Naskh Arabic" w:eastAsia="Noto Naskh Arabic" w:hAnsi="Noto Naskh Arabic"/>
+                <w:sz w:val="20"/>
+                <w:szCs w:val="20"/>
+                <w:rtl w:val="0"/>
+              </w:rPr>
+              <w:t xml:space="preserve">{{ r.mother_name }}</w:t>
             </w:r>
           </w:p>
         </w:tc>
@@ -3278,7 +3320,7 @@
                 <w:szCs w:val="20"/>
                 <w:rtl w:val="0"/>
               </w:rPr>
-              <w:t xml:space="preserve">{{ r.mother_name }}</w:t>
+              <w:t xml:space="preserve">{{ r.full_name }}</w:t>
             </w:r>
           </w:p>
         </w:tc>
@@ -3287,6 +3329,7 @@
           <w:p>
             <w:pPr>
               <w:widowControl w:val="0"/>
+              <w:bidi w:val="1"/>
               <w:rPr>
                 <w:rFonts w:ascii="Noto Naskh Arabic" w:cs="Noto Naskh Arabic" w:eastAsia="Noto Naskh Arabic" w:hAnsi="Noto Naskh Arabic"/>
                 <w:sz w:val="20"/>
@@ -3300,51 +3343,7 @@
                 <w:szCs w:val="20"/>
                 <w:rtl w:val="0"/>
               </w:rPr>
-              <w:t xml:space="preserve">{{ r.spouse_name }}</w:t>
-            </w:r>
-          </w:p>
-        </w:tc>
-        <w:tc>
-          <w:tcPr/>
-          <w:p>
-            <w:pPr>
-              <w:widowControl w:val="0"/>
-              <w:rPr>
-                <w:rFonts w:ascii="Noto Naskh Arabic" w:cs="Noto Naskh Arabic" w:eastAsia="Noto Naskh Arabic" w:hAnsi="Noto Naskh Arabic"/>
-                <w:sz w:val="20"/>
-                <w:szCs w:val="20"/>
-              </w:rPr>
-            </w:pPr>
-            <w:r>
-              <w:rPr>
-                <w:rFonts w:ascii="Noto Naskh Arabic" w:cs="Noto Naskh Arabic" w:eastAsia="Noto Naskh Arabic" w:hAnsi="Noto Naskh Arabic"/>
-                <w:sz w:val="20"/>
-                <w:szCs w:val="20"/>
-                <w:rtl w:val="0"/>
-              </w:rPr>
-              <w:t xml:space="preserve">{{ r.spouse_year }}</w:t>
-            </w:r>
-          </w:p>
-        </w:tc>
-        <w:tc>
-          <w:tcPr/>
-          <w:p>
-            <w:pPr>
-              <w:widowControl w:val="0"/>
-              <w:rPr>
-                <w:rFonts w:ascii="Noto Naskh Arabic" w:cs="Noto Naskh Arabic" w:eastAsia="Noto Naskh Arabic" w:hAnsi="Noto Naskh Arabic"/>
-                <w:sz w:val="20"/>
-                <w:szCs w:val="20"/>
-              </w:rPr>
-            </w:pPr>
-            <w:r>
-              <w:rPr>
-                <w:rFonts w:ascii="Noto Naskh Arabic" w:cs="Noto Naskh Arabic" w:eastAsia="Noto Naskh Arabic" w:hAnsi="Noto Naskh Arabic"/>
-                <w:sz w:val="20"/>
-                <w:szCs w:val="20"/>
-                <w:rtl w:val="0"/>
-              </w:rPr>
-              <w:t xml:space="preserve">{{ r.spouse_mother_name }}</w:t>
+              <w:t xml:space="preserve">{{ r.n }}</w:t>
             </w:r>
           </w:p>
         </w:tc>
@@ -3360,7 +3359,6 @@
           <w:p>
             <w:pPr>
               <w:widowControl w:val="0"/>
-              <w:bidi w:val="1"/>
               <w:rPr>
                 <w:rFonts w:ascii="Noto Naskh Arabic" w:cs="Noto Naskh Arabic" w:eastAsia="Noto Naskh Arabic" w:hAnsi="Noto Naskh Arabic"/>
                 <w:sz w:val="20"/>
@@ -3493,6 +3491,7 @@
           <w:p>
             <w:pPr>
               <w:widowControl w:val="0"/>
+              <w:bidi w:val="1"/>
               <w:rPr>
                 <w:rFonts w:ascii="Noto Naskh Arabic" w:cs="Noto Naskh Arabic" w:eastAsia="Noto Naskh Arabic" w:hAnsi="Noto Naskh Arabic"/>
                 <w:sz w:val="20"/>
@@ -3585,7 +3584,6 @@
       <w:pgMar w:bottom="990" w:top="868" w:left="851" w:right="851" w:header="720" w:footer="323"/>
       <w:pgNumType w:start="1"/>
       <w:titlePg w:val="1"/>
-      <w:bidi/>
     </w:sectPr>
   </w:body>
 </w:document>

</xml_diff>

<commit_message>
reports: dashboard and admin report endpoints with csv export
</commit_message>
<xml_diff>
--- a/docs/list.docx
+++ b/docs/list.docx
@@ -1,6 +1,6 @@
 
 <file path=word/document.xml><?xml version="1.0" encoding="utf-8"?>
-<w:document xmlns:ns2="urn:schemas-microsoft-com:vml" xmlns:ns3="urn:schemas-microsoft-com:office:office" xmlns:r="http://schemas.openxmlformats.org/officeDocument/2006/relationships" xmlns:w="http://schemas.openxmlformats.org/wordprocessingml/2006/main" xmlns:w14="http://schemas.microsoft.com/office/word/2010/wordml">
+<w:document xmlns:mc="http://schemas.openxmlformats.org/markup-compatibility/2006" xmlns:o="urn:schemas-microsoft-com:office:office" xmlns:r="http://schemas.openxmlformats.org/officeDocument/2006/relationships" xmlns:m="http://schemas.openxmlformats.org/officeDocument/2006/math" xmlns:v="urn:schemas-microsoft-com:vml" xmlns:wp="http://schemas.openxmlformats.org/drawingml/2006/wordprocessingDrawing" xmlns:w10="urn:schemas-microsoft-com:office:word" xmlns:w="http://schemas.openxmlformats.org/wordprocessingml/2006/main" xmlns:wne="http://schemas.microsoft.com/office/word/2006/wordml" xmlns:sl="http://schemas.openxmlformats.org/schemaLibrary/2006/main" xmlns:a="http://schemas.openxmlformats.org/drawingml/2006/main" xmlns:pic="http://schemas.openxmlformats.org/drawingml/2006/picture" xmlns:c="http://schemas.openxmlformats.org/drawingml/2006/chart" xmlns:lc="http://schemas.openxmlformats.org/drawingml/2006/lockedCanvas" xmlns:dgm="http://schemas.openxmlformats.org/drawingml/2006/diagram" xmlns:wps="http://schemas.microsoft.com/office/word/2010/wordprocessingShape" xmlns:wpg="http://schemas.microsoft.com/office/word/2010/wordprocessingGroup" xmlns:w14="http://schemas.microsoft.com/office/word/2010/wordml" xmlns:w15="http://schemas.microsoft.com/office/word/2012/wordml" xmlns:w16="http://schemas.microsoft.com/office/word/2018/wordml" xmlns:w16cex="http://schemas.microsoft.com/office/word/2018/wordml/cex" xmlns:w16cid="http://schemas.microsoft.com/office/word/2016/wordml/cid" xmlns="http://schemas.microsoft.com/office/tasks/2019/documenttasks" xmlns:cr="http://schemas.microsoft.com/office/comments/2020/reactions">
   <w:body>
     <w:p>
       <w:pPr>
@@ -17,7 +17,7 @@
       </w:pPr>
       <w:r>
         <w:pict>
-          <ns2:rect style="width:0.0pt;height:1.5pt" ns3:hr="t" ns3:hrstd="t" ns3:hralign="center" fillcolor="#A0A0A0" stroked="f"/>
+          <v:rect style="width:0.0pt;height:1.5pt" o:hr="t" o:hrstd="t" o:hralign="center" fillcolor="#A0A0A0" stroked="f"/>
         </w:pict>
       </w:r>
       <w:r>
@@ -1670,14 +1670,157 @@
     </w:p>
     <w:p>
       <w:pPr>
+        <w:keepNext w:val="0"/>
+        <w:keepLines w:val="0"/>
+        <w:pageBreakBefore w:val="0"/>
+        <w:widowControl w:val="1"/>
+        <w:pBdr>
+          <w:top w:space="0" w:sz="0" w:val="nil"/>
+          <w:left w:space="0" w:sz="0" w:val="nil"/>
+          <w:bottom w:space="0" w:sz="0" w:val="nil"/>
+          <w:right w:space="0" w:sz="0" w:val="nil"/>
+          <w:between w:space="0" w:sz="0" w:val="nil"/>
+        </w:pBdr>
+        <w:shd w:fill="auto" w:val="clear"/>
         <w:bidi w:val="1"/>
+        <w:spacing w:after="0" w:before="0" w:line="192" w:lineRule="auto"/>
         <w:ind w:left="0" w:right="0" w:firstLine="0"/>
-        <w:jc w:val="both"/>
-        <w:rPr>
-          <w:rFonts w:ascii="Noto Naskh Arabic" w:cs="Noto Naskh Arabic" w:eastAsia="Noto Naskh Arabic" w:hAnsi="Noto Naskh Arabic"/>
+        <w:jc w:val="left"/>
+        <w:rPr>
+          <w:rFonts w:ascii="Noto Naskh Arabic" w:cs="Noto Naskh Arabic" w:eastAsia="Noto Naskh Arabic" w:hAnsi="Noto Naskh Arabic"/>
+          <w:b w:val="0"/>
+          <w:bCs w:val="0"/>
+          <w:i w:val="0"/>
+          <w:iCs w:val="0"/>
+          <w:smallCaps w:val="0"/>
+          <w:strike w:val="0"/>
+          <w:color w:val="000000"/>
+          <w:sz w:val="32"/>
+          <w:szCs w:val="32"/>
+          <w:u w:val="none"/>
+          <w:shd w:fill="auto" w:val="clear"/>
           <w:vertAlign w:val="baseline"/>
         </w:rPr>
       </w:pPr>
+      <w:r>
+        <w:rPr>
+          <w:rtl w:val="0"/>
+        </w:rPr>
+      </w:r>
+      <w:r>
+        <w:rPr>
+          <w:rFonts w:ascii="Noto Naskh Arabic" w:cs="Noto Naskh Arabic" w:eastAsia="Noto Naskh Arabic" w:hAnsi="Noto Naskh Arabic"/>
+          <w:b w:val="1"/>
+          <w:bCs w:val="1"/>
+          <w:i w:val="0"/>
+          <w:iCs w:val="0"/>
+          <w:smallCaps w:val="0"/>
+          <w:strike w:val="0"/>
+          <w:color w:val="000000"/>
+          <w:sz w:val="32"/>
+          <w:szCs w:val="32"/>
+          <w:u w:val="none"/>
+          <w:shd w:fill="auto" w:val="clear"/>
+          <w:vertAlign w:val="baseline"/>
+          <w:rtl w:val="1"/>
+        </w:rPr>
+        <w:t xml:space="preserve">                                                                                                            </w:t>
+      </w:r>
+      <w:r>
+        <w:rPr>
+          <w:rFonts w:ascii="Noto Naskh Arabic" w:cs="Noto Naskh Arabic" w:eastAsia="Noto Naskh Arabic" w:hAnsi="Noto Naskh Arabic"/>
+          <w:b w:val="1"/>
+          <w:bCs w:val="1"/>
+          <w:i w:val="0"/>
+          <w:iCs w:val="0"/>
+          <w:smallCaps w:val="0"/>
+          <w:strike w:val="0"/>
+          <w:color w:val="000000"/>
+          <w:sz w:val="32"/>
+          <w:szCs w:val="32"/>
+          <w:u w:val="none"/>
+          <w:shd w:fill="auto" w:val="clear"/>
+          <w:vertAlign w:val="baseline"/>
+          <w:rtl w:val="1"/>
+        </w:rPr>
+        <w:t xml:space="preserve">لـیـلى</w:t>
+      </w:r>
+      <w:r>
+        <w:rPr>
+          <w:rFonts w:ascii="Noto Naskh Arabic" w:cs="Noto Naskh Arabic" w:eastAsia="Noto Naskh Arabic" w:hAnsi="Noto Naskh Arabic"/>
+          <w:b w:val="1"/>
+          <w:bCs w:val="1"/>
+          <w:i w:val="0"/>
+          <w:iCs w:val="0"/>
+          <w:smallCaps w:val="0"/>
+          <w:strike w:val="0"/>
+          <w:color w:val="000000"/>
+          <w:sz w:val="32"/>
+          <w:szCs w:val="32"/>
+          <w:u w:val="none"/>
+          <w:shd w:fill="auto" w:val="clear"/>
+          <w:vertAlign w:val="baseline"/>
+          <w:rtl w:val="1"/>
+        </w:rPr>
+        <w:t xml:space="preserve"> </w:t>
+      </w:r>
+      <w:r>
+        <w:rPr>
+          <w:rFonts w:ascii="Noto Naskh Arabic" w:cs="Noto Naskh Arabic" w:eastAsia="Noto Naskh Arabic" w:hAnsi="Noto Naskh Arabic"/>
+          <w:b w:val="1"/>
+          <w:bCs w:val="1"/>
+          <w:i w:val="0"/>
+          <w:iCs w:val="0"/>
+          <w:smallCaps w:val="0"/>
+          <w:strike w:val="0"/>
+          <w:color w:val="000000"/>
+          <w:sz w:val="32"/>
+          <w:szCs w:val="32"/>
+          <w:u w:val="none"/>
+          <w:shd w:fill="auto" w:val="clear"/>
+          <w:vertAlign w:val="baseline"/>
+          <w:rtl w:val="1"/>
+        </w:rPr>
+        <w:t xml:space="preserve">عـمـر</w:t>
+      </w:r>
+      <w:r>
+        <w:rPr>
+          <w:rFonts w:ascii="Noto Naskh Arabic" w:cs="Noto Naskh Arabic" w:eastAsia="Noto Naskh Arabic" w:hAnsi="Noto Naskh Arabic"/>
+          <w:b w:val="1"/>
+          <w:bCs w:val="1"/>
+          <w:i w:val="0"/>
+          <w:iCs w:val="0"/>
+          <w:smallCaps w:val="0"/>
+          <w:strike w:val="0"/>
+          <w:color w:val="000000"/>
+          <w:sz w:val="32"/>
+          <w:szCs w:val="32"/>
+          <w:u w:val="none"/>
+          <w:shd w:fill="auto" w:val="clear"/>
+          <w:vertAlign w:val="baseline"/>
+          <w:rtl w:val="1"/>
+        </w:rPr>
+        <w:t xml:space="preserve"> </w:t>
+      </w:r>
+      <w:r>
+        <w:rPr>
+          <w:rFonts w:ascii="Noto Naskh Arabic" w:cs="Noto Naskh Arabic" w:eastAsia="Noto Naskh Arabic" w:hAnsi="Noto Naskh Arabic"/>
+          <w:b w:val="1"/>
+          <w:bCs w:val="1"/>
+          <w:i w:val="0"/>
+          <w:iCs w:val="0"/>
+          <w:smallCaps w:val="0"/>
+          <w:strike w:val="0"/>
+          <w:color w:val="000000"/>
+          <w:sz w:val="32"/>
+          <w:szCs w:val="32"/>
+          <w:u w:val="none"/>
+          <w:shd w:fill="auto" w:val="clear"/>
+          <w:vertAlign w:val="baseline"/>
+          <w:rtl w:val="1"/>
+        </w:rPr>
+        <w:t xml:space="preserve">عـلـى</w:t>
+      </w:r>
       <w:r>
         <w:rPr>
           <w:rtl w:val="0"/>
@@ -1740,7 +1883,7 @@
           <w:vertAlign w:val="baseline"/>
           <w:rtl w:val="1"/>
         </w:rPr>
-        <w:t xml:space="preserve">                                                                                                            </w:t>
+        <w:t xml:space="preserve">                                                                                               </w:t>
       </w:r>
       <w:r>
         <w:rPr>
@@ -1759,7 +1902,7 @@
           <w:vertAlign w:val="baseline"/>
           <w:rtl w:val="1"/>
         </w:rPr>
-        <w:t xml:space="preserve">لـیـلى</w:t>
+        <w:t xml:space="preserve">سەرۆکی</w:t>
       </w:r>
       <w:r>
         <w:rPr>
@@ -1797,7 +1940,7 @@
           <w:vertAlign w:val="baseline"/>
           <w:rtl w:val="1"/>
         </w:rPr>
-        <w:t xml:space="preserve">عـمـر</w:t>
+        <w:t xml:space="preserve">شارەوانیی</w:t>
       </w:r>
       <w:r>
         <w:rPr>
@@ -1835,7 +1978,7 @@
           <w:vertAlign w:val="baseline"/>
           <w:rtl w:val="1"/>
         </w:rPr>
-        <w:t xml:space="preserve">عـلـى</w:t>
+        <w:t xml:space="preserve">سلـێمانی</w:t>
       </w:r>
       <w:r>
         <w:rPr>
@@ -1879,11 +2022,6 @@
       </w:pPr>
       <w:r>
         <w:rPr>
-          <w:rtl w:val="0"/>
-        </w:rPr>
-      </w:r>
-      <w:r>
-        <w:rPr>
           <w:rFonts w:ascii="Noto Naskh Arabic" w:cs="Noto Naskh Arabic" w:eastAsia="Noto Naskh Arabic" w:hAnsi="Noto Naskh Arabic"/>
           <w:b w:val="1"/>
           <w:bCs w:val="1"/>
@@ -1897,160 +2035,6 @@
           <w:u w:val="none"/>
           <w:shd w:fill="auto" w:val="clear"/>
           <w:vertAlign w:val="baseline"/>
-          <w:rtl w:val="1"/>
-        </w:rPr>
-        <w:t xml:space="preserve">                                                                                               </w:t>
-      </w:r>
-      <w:r>
-        <w:rPr>
-          <w:rFonts w:ascii="Noto Naskh Arabic" w:cs="Noto Naskh Arabic" w:eastAsia="Noto Naskh Arabic" w:hAnsi="Noto Naskh Arabic"/>
-          <w:b w:val="1"/>
-          <w:bCs w:val="1"/>
-          <w:i w:val="0"/>
-          <w:iCs w:val="0"/>
-          <w:smallCaps w:val="0"/>
-          <w:strike w:val="0"/>
-          <w:color w:val="000000"/>
-          <w:sz w:val="32"/>
-          <w:szCs w:val="32"/>
-          <w:u w:val="none"/>
-          <w:shd w:fill="auto" w:val="clear"/>
-          <w:vertAlign w:val="baseline"/>
-          <w:rtl w:val="1"/>
-        </w:rPr>
-        <w:t xml:space="preserve">سەرۆکی</w:t>
-      </w:r>
-      <w:r>
-        <w:rPr>
-          <w:rFonts w:ascii="Noto Naskh Arabic" w:cs="Noto Naskh Arabic" w:eastAsia="Noto Naskh Arabic" w:hAnsi="Noto Naskh Arabic"/>
-          <w:b w:val="1"/>
-          <w:bCs w:val="1"/>
-          <w:i w:val="0"/>
-          <w:iCs w:val="0"/>
-          <w:smallCaps w:val="0"/>
-          <w:strike w:val="0"/>
-          <w:color w:val="000000"/>
-          <w:sz w:val="32"/>
-          <w:szCs w:val="32"/>
-          <w:u w:val="none"/>
-          <w:shd w:fill="auto" w:val="clear"/>
-          <w:vertAlign w:val="baseline"/>
-          <w:rtl w:val="1"/>
-        </w:rPr>
-        <w:t xml:space="preserve"> </w:t>
-      </w:r>
-      <w:r>
-        <w:rPr>
-          <w:rFonts w:ascii="Noto Naskh Arabic" w:cs="Noto Naskh Arabic" w:eastAsia="Noto Naskh Arabic" w:hAnsi="Noto Naskh Arabic"/>
-          <w:b w:val="1"/>
-          <w:bCs w:val="1"/>
-          <w:i w:val="0"/>
-          <w:iCs w:val="0"/>
-          <w:smallCaps w:val="0"/>
-          <w:strike w:val="0"/>
-          <w:color w:val="000000"/>
-          <w:sz w:val="32"/>
-          <w:szCs w:val="32"/>
-          <w:u w:val="none"/>
-          <w:shd w:fill="auto" w:val="clear"/>
-          <w:vertAlign w:val="baseline"/>
-          <w:rtl w:val="1"/>
-        </w:rPr>
-        <w:t xml:space="preserve">شارەوانیی</w:t>
-      </w:r>
-      <w:r>
-        <w:rPr>
-          <w:rFonts w:ascii="Noto Naskh Arabic" w:cs="Noto Naskh Arabic" w:eastAsia="Noto Naskh Arabic" w:hAnsi="Noto Naskh Arabic"/>
-          <w:b w:val="1"/>
-          <w:bCs w:val="1"/>
-          <w:i w:val="0"/>
-          <w:iCs w:val="0"/>
-          <w:smallCaps w:val="0"/>
-          <w:strike w:val="0"/>
-          <w:color w:val="000000"/>
-          <w:sz w:val="32"/>
-          <w:szCs w:val="32"/>
-          <w:u w:val="none"/>
-          <w:shd w:fill="auto" w:val="clear"/>
-          <w:vertAlign w:val="baseline"/>
-          <w:rtl w:val="1"/>
-        </w:rPr>
-        <w:t xml:space="preserve"> </w:t>
-      </w:r>
-      <w:r>
-        <w:rPr>
-          <w:rFonts w:ascii="Noto Naskh Arabic" w:cs="Noto Naskh Arabic" w:eastAsia="Noto Naskh Arabic" w:hAnsi="Noto Naskh Arabic"/>
-          <w:b w:val="1"/>
-          <w:bCs w:val="1"/>
-          <w:i w:val="0"/>
-          <w:iCs w:val="0"/>
-          <w:smallCaps w:val="0"/>
-          <w:strike w:val="0"/>
-          <w:color w:val="000000"/>
-          <w:sz w:val="32"/>
-          <w:szCs w:val="32"/>
-          <w:u w:val="none"/>
-          <w:shd w:fill="auto" w:val="clear"/>
-          <w:vertAlign w:val="baseline"/>
-          <w:rtl w:val="1"/>
-        </w:rPr>
-        <w:t xml:space="preserve">سلـێمانی</w:t>
-      </w:r>
-      <w:r>
-        <w:rPr>
-          <w:rtl w:val="0"/>
-        </w:rPr>
-      </w:r>
-    </w:p>
-    <w:p>
-      <w:pPr>
-        <w:keepNext w:val="0"/>
-        <w:keepLines w:val="0"/>
-        <w:pageBreakBefore w:val="0"/>
-        <w:widowControl w:val="1"/>
-        <w:pBdr>
-          <w:top w:space="0" w:sz="0" w:val="nil"/>
-          <w:left w:space="0" w:sz="0" w:val="nil"/>
-          <w:bottom w:space="0" w:sz="0" w:val="nil"/>
-          <w:right w:space="0" w:sz="0" w:val="nil"/>
-          <w:between w:space="0" w:sz="0" w:val="nil"/>
-        </w:pBdr>
-        <w:shd w:fill="auto" w:val="clear"/>
-        <w:bidi w:val="1"/>
-        <w:spacing w:after="0" w:before="0" w:line="192" w:lineRule="auto"/>
-        <w:ind w:left="0" w:right="0" w:firstLine="0"/>
-        <w:jc w:val="left"/>
-        <w:rPr>
-          <w:rFonts w:ascii="Noto Naskh Arabic" w:cs="Noto Naskh Arabic" w:eastAsia="Noto Naskh Arabic" w:hAnsi="Noto Naskh Arabic"/>
-          <w:b w:val="0"/>
-          <w:bCs w:val="0"/>
-          <w:i w:val="0"/>
-          <w:iCs w:val="0"/>
-          <w:smallCaps w:val="0"/>
-          <w:strike w:val="0"/>
-          <w:color w:val="000000"/>
-          <w:sz w:val="32"/>
-          <w:szCs w:val="32"/>
-          <w:u w:val="none"/>
-          <w:shd w:fill="auto" w:val="clear"/>
-          <w:vertAlign w:val="baseline"/>
-        </w:rPr>
-      </w:pPr>
-      <w:r>
-        <w:rPr>
-          <w:rFonts w:ascii="Noto Naskh Arabic" w:cs="Noto Naskh Arabic" w:eastAsia="Noto Naskh Arabic" w:hAnsi="Noto Naskh Arabic"/>
-          <w:b w:val="1"/>
-          <w:bCs w:val="1"/>
-          <w:i w:val="0"/>
-          <w:iCs w:val="0"/>
-          <w:smallCaps w:val="0"/>
-          <w:strike w:val="0"/>
-          <w:color w:val="000000"/>
-          <w:sz w:val="32"/>
-          <w:szCs w:val="32"/>
-          <w:u w:val="none"/>
-          <w:shd w:fill="auto" w:val="clear"/>
-          <w:vertAlign w:val="baseline"/>
           <w:rtl w:val="0"/>
         </w:rPr>
         <w:t xml:space="preserve">                                                                                                               </w:t>
@@ -2064,7 +2048,7 @@
     <w:p>
       <w:pPr>
         <w:bidi w:val="1"/>
-        <w:ind w:left="-172" w:right="0" w:hanging="314"/>
+        <w:ind w:left="-172" w:right="0" w:hanging="313.99999999999994"/>
         <w:jc w:val="both"/>
         <w:rPr>
           <w:rFonts w:ascii="Noto Naskh Arabic" w:cs="Noto Naskh Arabic" w:eastAsia="Noto Naskh Arabic" w:hAnsi="Noto Naskh Arabic"/>
@@ -2348,6 +2332,11 @@
         </w:rPr>
         <w:t xml:space="preserve">.</w:t>
       </w:r>
+      <w:r>
+        <w:rPr>
+          <w:rtl w:val="0"/>
+        </w:rPr>
+      </w:r>
     </w:p>
     <w:p>
       <w:pPr>
@@ -2483,6 +2472,11 @@
         </w:rPr>
         <w:t xml:space="preserve">.</w:t>
       </w:r>
+      <w:r>
+        <w:rPr>
+          <w:rtl w:val="0"/>
+        </w:rPr>
+      </w:r>
     </w:p>
     <w:p>
       <w:pPr>
@@ -2598,6 +2592,11 @@
         </w:rPr>
         <w:t xml:space="preserve"> .</w:t>
       </w:r>
+      <w:r>
+        <w:rPr>
+          <w:rtl w:val="0"/>
+        </w:rPr>
+      </w:r>
     </w:p>
     <w:p>
       <w:pPr>
@@ -2713,6 +2712,11 @@
         </w:rPr>
         <w:t xml:space="preserve">.</w:t>
       </w:r>
+      <w:r>
+        <w:rPr>
+          <w:rtl w:val="0"/>
+        </w:rPr>
+      </w:r>
     </w:p>
     <w:p>
       <w:pPr>
@@ -2780,6 +2784,11 @@
         </w:rPr>
         <w:t xml:space="preserve">   </w:t>
       </w:r>
+      <w:r>
+        <w:rPr>
+          <w:rtl w:val="0"/>
+        </w:rPr>
+      </w:r>
     </w:p>
     <w:p>
       <w:pPr>
@@ -2798,7 +2807,7 @@
     <w:tbl>
       <w:tblPr>
         <w:tblStyle w:val="Table1"/>
-        <w:tblW w:w="10204" w:type="dxa"/>
+        <w:tblW w:w="10204.0" w:type="dxa"/>
         <w:jc w:val="left"/>
         <w:tblBorders>
           <w:top w:color="000000" w:space="0" w:sz="8" w:val="single"/>
@@ -2819,6 +2828,17 @@
         <w:gridCol w:w="1020"/>
         <w:gridCol w:w="2200"/>
         <w:gridCol w:w="620"/>
+        <w:tblGridChange w:id="0">
+          <w:tblGrid>
+            <w:gridCol w:w="1575"/>
+            <w:gridCol w:w="1020"/>
+            <w:gridCol w:w="2194"/>
+            <w:gridCol w:w="1575"/>
+            <w:gridCol w:w="1020"/>
+            <w:gridCol w:w="2200"/>
+            <w:gridCol w:w="620"/>
+          </w:tblGrid>
+        </w:tblGridChange>
       </w:tblGrid>
       <w:tr>
         <w:trPr>
@@ -3065,12 +3085,8 @@
             </w:pPr>
             <w:r>
               <w:rPr>
-                <w:rFonts w:ascii="Noto Naskh Arabic" w:cs="Noto Naskh Arabic" w:eastAsia="Noto Naskh Arabic" w:hAnsi="Noto Naskh Arabic"/>
-                <w:sz w:val="20"/>
-                <w:szCs w:val="20"/>
                 <w:rtl w:val="0"/>
               </w:rPr>
-              <w:t xml:space="preserve"/>
             </w:r>
           </w:p>
         </w:tc>
@@ -3087,12 +3103,8 @@
             </w:pPr>
             <w:r>
               <w:rPr>
-                <w:rFonts w:ascii="Noto Naskh Arabic" w:cs="Noto Naskh Arabic" w:eastAsia="Noto Naskh Arabic" w:hAnsi="Noto Naskh Arabic"/>
-                <w:sz w:val="20"/>
-                <w:szCs w:val="20"/>
                 <w:rtl w:val="0"/>
               </w:rPr>
-              <w:t xml:space="preserve"/>
             </w:r>
           </w:p>
         </w:tc>
@@ -3109,12 +3121,8 @@
             </w:pPr>
             <w:r>
               <w:rPr>
-                <w:rFonts w:ascii="Noto Naskh Arabic" w:cs="Noto Naskh Arabic" w:eastAsia="Noto Naskh Arabic" w:hAnsi="Noto Naskh Arabic"/>
-                <w:sz w:val="20"/>
-                <w:szCs w:val="20"/>
                 <w:rtl w:val="0"/>
               </w:rPr>
-              <w:t xml:space="preserve"/>
             </w:r>
           </w:p>
         </w:tc>
@@ -3131,12 +3139,8 @@
             </w:pPr>
             <w:r>
               <w:rPr>
-                <w:rFonts w:ascii="Noto Naskh Arabic" w:cs="Noto Naskh Arabic" w:eastAsia="Noto Naskh Arabic" w:hAnsi="Noto Naskh Arabic"/>
-                <w:sz w:val="20"/>
-                <w:szCs w:val="20"/>
                 <w:rtl w:val="0"/>
               </w:rPr>
-              <w:t xml:space="preserve"/>
             </w:r>
           </w:p>
         </w:tc>
@@ -3153,12 +3157,8 @@
             </w:pPr>
             <w:r>
               <w:rPr>
-                <w:rFonts w:ascii="Noto Naskh Arabic" w:cs="Noto Naskh Arabic" w:eastAsia="Noto Naskh Arabic" w:hAnsi="Noto Naskh Arabic"/>
-                <w:sz w:val="20"/>
-                <w:szCs w:val="20"/>
                 <w:rtl w:val="0"/>
               </w:rPr>
-              <w:t xml:space="preserve"/>
             </w:r>
           </w:p>
         </w:tc>
@@ -3176,12 +3176,8 @@
             </w:pPr>
             <w:r>
               <w:rPr>
-                <w:rFonts w:ascii="Noto Naskh Arabic" w:cs="Noto Naskh Arabic" w:eastAsia="Noto Naskh Arabic" w:hAnsi="Noto Naskh Arabic"/>
-                <w:sz w:val="20"/>
-                <w:szCs w:val="20"/>
                 <w:rtl w:val="0"/>
               </w:rPr>
-              <w:t xml:space="preserve"/>
             </w:r>
           </w:p>
         </w:tc>
@@ -3389,12 +3385,8 @@
             </w:pPr>
             <w:r>
               <w:rPr>
-                <w:rFonts w:ascii="Noto Naskh Arabic" w:cs="Noto Naskh Arabic" w:eastAsia="Noto Naskh Arabic" w:hAnsi="Noto Naskh Arabic"/>
-                <w:sz w:val="20"/>
-                <w:szCs w:val="20"/>
                 <w:rtl w:val="0"/>
               </w:rPr>
-              <w:t xml:space="preserve"/>
             </w:r>
           </w:p>
         </w:tc>
@@ -3411,12 +3403,8 @@
             </w:pPr>
             <w:r>
               <w:rPr>
-                <w:rFonts w:ascii="Noto Naskh Arabic" w:cs="Noto Naskh Arabic" w:eastAsia="Noto Naskh Arabic" w:hAnsi="Noto Naskh Arabic"/>
-                <w:sz w:val="20"/>
-                <w:szCs w:val="20"/>
                 <w:rtl w:val="0"/>
               </w:rPr>
-              <w:t xml:space="preserve"/>
             </w:r>
           </w:p>
         </w:tc>
@@ -3433,12 +3421,8 @@
             </w:pPr>
             <w:r>
               <w:rPr>
-                <w:rFonts w:ascii="Noto Naskh Arabic" w:cs="Noto Naskh Arabic" w:eastAsia="Noto Naskh Arabic" w:hAnsi="Noto Naskh Arabic"/>
-                <w:sz w:val="20"/>
-                <w:szCs w:val="20"/>
                 <w:rtl w:val="0"/>
               </w:rPr>
-              <w:t xml:space="preserve"/>
             </w:r>
           </w:p>
         </w:tc>
@@ -3455,12 +3439,8 @@
             </w:pPr>
             <w:r>
               <w:rPr>
-                <w:rFonts w:ascii="Noto Naskh Arabic" w:cs="Noto Naskh Arabic" w:eastAsia="Noto Naskh Arabic" w:hAnsi="Noto Naskh Arabic"/>
-                <w:sz w:val="20"/>
-                <w:szCs w:val="20"/>
                 <w:rtl w:val="0"/>
               </w:rPr>
-              <w:t xml:space="preserve"/>
             </w:r>
           </w:p>
         </w:tc>
@@ -3477,12 +3457,8 @@
             </w:pPr>
             <w:r>
               <w:rPr>
-                <w:rFonts w:ascii="Noto Naskh Arabic" w:cs="Noto Naskh Arabic" w:eastAsia="Noto Naskh Arabic" w:hAnsi="Noto Naskh Arabic"/>
-                <w:sz w:val="20"/>
-                <w:szCs w:val="20"/>
                 <w:rtl w:val="0"/>
               </w:rPr>
-              <w:t xml:space="preserve"/>
             </w:r>
           </w:p>
         </w:tc>
@@ -3500,12 +3476,8 @@
             </w:pPr>
             <w:r>
               <w:rPr>
-                <w:rFonts w:ascii="Noto Naskh Arabic" w:cs="Noto Naskh Arabic" w:eastAsia="Noto Naskh Arabic" w:hAnsi="Noto Naskh Arabic"/>
-                <w:sz w:val="20"/>
-                <w:szCs w:val="20"/>
                 <w:rtl w:val="0"/>
               </w:rPr>
-              <w:t xml:space="preserve"/>
             </w:r>
           </w:p>
         </w:tc>
@@ -3590,110 +3562,6 @@
 </file>
 
 <file path=word/footer1.xml><?xml version="1.0" encoding="utf-8"?>
-<w:ftr xmlns:mc="http://schemas.openxmlformats.org/markup-compatibility/2006" xmlns:o="urn:schemas-microsoft-com:office:office" xmlns:r="http://schemas.openxmlformats.org/officeDocument/2006/relationships" xmlns:m="http://schemas.openxmlformats.org/officeDocument/2006/math" xmlns:v="urn:schemas-microsoft-com:vml" xmlns:wp="http://schemas.openxmlformats.org/drawingml/2006/wordprocessingDrawing" xmlns:w10="urn:schemas-microsoft-com:office:word" xmlns:w="http://schemas.openxmlformats.org/wordprocessingml/2006/main" xmlns:wne="http://schemas.microsoft.com/office/word/2006/wordml" xmlns:sl="http://schemas.openxmlformats.org/schemaLibrary/2006/main" xmlns:a="http://schemas.openxmlformats.org/drawingml/2006/main" xmlns:pic="http://schemas.openxmlformats.org/drawingml/2006/picture" xmlns:c="http://schemas.openxmlformats.org/drawingml/2006/chart" xmlns:lc="http://schemas.openxmlformats.org/drawingml/2006/lockedCanvas" xmlns:dgm="http://schemas.openxmlformats.org/drawingml/2006/diagram" xmlns:wps="http://schemas.microsoft.com/office/word/2010/wordprocessingShape" xmlns:wpg="http://schemas.microsoft.com/office/word/2010/wordprocessingGroup" xmlns:w14="http://schemas.microsoft.com/office/word/2010/wordml" xmlns:w15="http://schemas.microsoft.com/office/word/2012/wordml" xmlns:w16="http://schemas.microsoft.com/office/word/2018/wordml" xmlns:w16cex="http://schemas.microsoft.com/office/word/2018/wordml/cex" xmlns:w16cid="http://schemas.microsoft.com/office/word/2016/wordml/cid" xmlns="http://schemas.microsoft.com/office/tasks/2019/documenttasks" xmlns:cr="http://schemas.microsoft.com/office/comments/2020/reactions">
-  <w:p>
-    <w:pPr>
-      <w:keepNext w:val="0"/>
-      <w:keepLines w:val="0"/>
-      <w:pageBreakBefore w:val="0"/>
-      <w:widowControl w:val="1"/>
-      <w:pBdr>
-        <w:top w:space="0" w:sz="0" w:val="nil"/>
-        <w:left w:space="0" w:sz="0" w:val="nil"/>
-        <w:bottom w:space="0" w:sz="0" w:val="nil"/>
-        <w:right w:space="0" w:sz="0" w:val="nil"/>
-        <w:between w:space="0" w:sz="0" w:val="nil"/>
-      </w:pBdr>
-      <w:shd w:fill="auto" w:val="clear"/>
-      <w:spacing w:after="0" w:before="0" w:line="240" w:lineRule="auto"/>
-      <w:ind w:left="0" w:right="0" w:firstLine="0"/>
-      <w:jc w:val="left"/>
-      <w:rPr>
-        <w:rFonts w:ascii="Times New Roman" w:cs="Times New Roman" w:eastAsia="Times New Roman" w:hAnsi="Times New Roman"/>
-        <w:b w:val="0"/>
-        <w:bCs w:val="0"/>
-        <w:i w:val="0"/>
-        <w:iCs w:val="0"/>
-        <w:smallCaps w:val="0"/>
-        <w:strike w:val="0"/>
-        <w:color w:val="000000"/>
-        <w:sz w:val="24"/>
-        <w:szCs w:val="24"/>
-        <w:u w:val="none"/>
-        <w:shd w:fill="auto" w:val="clear"/>
-        <w:vertAlign w:val="baseline"/>
-      </w:rPr>
-    </w:pPr>
-    <w:r>
-      <w:rPr>
-        <w:rFonts w:ascii="Times New Roman" w:cs="Times New Roman" w:eastAsia="Times New Roman" w:hAnsi="Times New Roman"/>
-        <w:b w:val="0"/>
-        <w:bCs w:val="0"/>
-        <w:i w:val="0"/>
-        <w:iCs w:val="0"/>
-        <w:smallCaps w:val="0"/>
-        <w:strike w:val="0"/>
-        <w:color w:val="000000"/>
-        <w:sz w:val="24"/>
-        <w:szCs w:val="24"/>
-        <w:u w:val="none"/>
-        <w:shd w:fill="auto" w:val="clear"/>
-        <w:vertAlign w:val="baseline"/>
-      </w:rPr>
-      <w:fldChar w:fldCharType="begin"/>
-      <w:instrText xml:space="preserve">PAGE</w:instrText>
-      <w:fldChar w:fldCharType="separate"/>
-      <w:fldChar w:fldCharType="end"/>
-    </w:r>
-    <w:r>
-      <w:rPr>
-        <w:rtl w:val="0"/>
-      </w:rPr>
-    </w:r>
-  </w:p>
-  <w:p>
-    <w:pPr>
-      <w:keepNext w:val="0"/>
-      <w:keepLines w:val="0"/>
-      <w:pageBreakBefore w:val="0"/>
-      <w:widowControl w:val="1"/>
-      <w:pBdr>
-        <w:top w:space="0" w:sz="0" w:val="nil"/>
-        <w:left w:space="0" w:sz="0" w:val="nil"/>
-        <w:bottom w:space="0" w:sz="0" w:val="nil"/>
-        <w:right w:space="0" w:sz="0" w:val="nil"/>
-        <w:between w:space="0" w:sz="0" w:val="nil"/>
-      </w:pBdr>
-      <w:shd w:fill="auto" w:val="clear"/>
-      <w:spacing w:after="0" w:before="0" w:line="240" w:lineRule="auto"/>
-      <w:ind w:left="0" w:right="0" w:firstLine="360"/>
-      <w:jc w:val="left"/>
-      <w:rPr>
-        <w:rFonts w:ascii="Times New Roman" w:cs="Times New Roman" w:eastAsia="Times New Roman" w:hAnsi="Times New Roman"/>
-        <w:b w:val="0"/>
-        <w:bCs w:val="0"/>
-        <w:i w:val="0"/>
-        <w:iCs w:val="0"/>
-        <w:smallCaps w:val="0"/>
-        <w:strike w:val="0"/>
-        <w:color w:val="000000"/>
-        <w:sz w:val="24"/>
-        <w:szCs w:val="24"/>
-        <w:u w:val="none"/>
-        <w:shd w:fill="auto" w:val="clear"/>
-        <w:vertAlign w:val="baseline"/>
-      </w:rPr>
-    </w:pPr>
-    <w:r>
-      <w:rPr>
-        <w:rtl w:val="0"/>
-      </w:rPr>
-    </w:r>
-  </w:p>
-</w:ftr>
-</file>
-
-<file path=word/footer2.xml><?xml version="1.0" encoding="utf-8"?>
 <w:ftr xmlns:mc="http://schemas.openxmlformats.org/markup-compatibility/2006" xmlns:o="urn:schemas-microsoft-com:office:office" xmlns:r="http://schemas.openxmlformats.org/officeDocument/2006/relationships" xmlns:m="http://schemas.openxmlformats.org/officeDocument/2006/math" xmlns:v="urn:schemas-microsoft-com:vml" xmlns:wp="http://schemas.openxmlformats.org/drawingml/2006/wordprocessingDrawing" xmlns:w10="urn:schemas-microsoft-com:office:word" xmlns:w="http://schemas.openxmlformats.org/wordprocessingml/2006/main" xmlns:wne="http://schemas.microsoft.com/office/word/2006/wordml" xmlns:sl="http://schemas.openxmlformats.org/schemaLibrary/2006/main" xmlns:a="http://schemas.openxmlformats.org/drawingml/2006/main" xmlns:pic="http://schemas.openxmlformats.org/drawingml/2006/picture" xmlns:c="http://schemas.openxmlformats.org/drawingml/2006/chart" xmlns:lc="http://schemas.openxmlformats.org/drawingml/2006/lockedCanvas" xmlns:dgm="http://schemas.openxmlformats.org/drawingml/2006/diagram" xmlns:wps="http://schemas.microsoft.com/office/word/2010/wordprocessingShape" xmlns:wpg="http://schemas.microsoft.com/office/word/2010/wordprocessingGroup" xmlns:w14="http://schemas.microsoft.com/office/word/2010/wordml" xmlns:w15="http://schemas.microsoft.com/office/word/2012/wordml" xmlns:w16="http://schemas.microsoft.com/office/word/2018/wordml" xmlns:w16cex="http://schemas.microsoft.com/office/word/2018/wordml/cex" xmlns:w16cid="http://schemas.microsoft.com/office/word/2016/wordml/cid" xmlns="http://schemas.microsoft.com/office/tasks/2019/documenttasks" xmlns:cr="http://schemas.microsoft.com/office/comments/2020/reactions">
   <w:p>
     <w:pPr>
@@ -3762,15 +3630,15 @@
             <wp:anchor allowOverlap="1" behindDoc="0" distB="0" distT="0" distL="114300" distR="114300" hidden="0" layoutInCell="1" locked="0" relativeHeight="0" simplePos="0">
               <wp:simplePos x="0" y="0"/>
               <wp:positionH relativeFrom="column">
-                <wp:posOffset>-180974</wp:posOffset>
+                <wp:posOffset>-187322</wp:posOffset>
               </wp:positionH>
               <wp:positionV relativeFrom="paragraph">
-                <wp:posOffset>-48259</wp:posOffset>
+                <wp:posOffset>-54607</wp:posOffset>
               </wp:positionV>
-              <wp:extent cx="6858000" cy="12700"/>
+              <wp:extent cx="6870700" cy="25400"/>
               <wp:effectExtent b="0" l="0" r="0" t="0"/>
               <wp:wrapNone/>
-              <wp:docPr id="4" name=""/>
+              <wp:docPr id="2" name=""/>
               <a:graphic>
                 <a:graphicData uri="http://schemas.microsoft.com/office/word/2010/wordprocessingShape">
                   <wps:wsp>
@@ -3791,9 +3659,9 @@
                           <a:srgbClr val="000000"/>
                         </a:solidFill>
                         <a:prstDash val="solid"/>
-                        <a:miter lim="8000"/>
-                        <a:headEnd len="med" w="med" type="none"/>
-                        <a:tailEnd len="med" w="med" type="none"/>
+                        <a:miter lim="80"/>
+                        <a:headEnd len="sm" w="sm" type="none"/>
+                        <a:tailEnd len="sm" w="sm" type="none"/>
                       </a:ln>
                     </wps:spPr>
                     <wps:bodyPr anchorCtr="0" anchor="ctr" bIns="91425" lIns="91425" spcFirstLastPara="1" rIns="91425" wrap="square" tIns="91425">
@@ -3810,20 +3678,20 @@
             <wp:anchor allowOverlap="1" behindDoc="0" distB="0" distT="0" distL="114300" distR="114300" hidden="0" layoutInCell="1" locked="0" relativeHeight="0" simplePos="0">
               <wp:simplePos x="0" y="0"/>
               <wp:positionH relativeFrom="column">
-                <wp:posOffset>-180974</wp:posOffset>
+                <wp:posOffset>-187322</wp:posOffset>
               </wp:positionH>
               <wp:positionV relativeFrom="paragraph">
-                <wp:posOffset>-48259</wp:posOffset>
+                <wp:posOffset>-54607</wp:posOffset>
               </wp:positionV>
-              <wp:extent cx="6858000" cy="12700"/>
+              <wp:extent cx="6870700" cy="25400"/>
               <wp:effectExtent b="0" l="0" r="0" t="0"/>
               <wp:wrapNone/>
-              <wp:docPr id="4" name="image5.png"/>
+              <wp:docPr id="2" name="image3.png"/>
               <a:graphic>
                 <a:graphicData uri="http://schemas.openxmlformats.org/drawingml/2006/picture">
                   <pic:pic>
                     <pic:nvPicPr>
-                      <pic:cNvPr id="0" name="image5.png"/>
+                      <pic:cNvPr id="0" name="image3.png"/>
                       <pic:cNvPicPr preferRelativeResize="0"/>
                     </pic:nvPicPr>
                     <pic:blipFill>
@@ -3836,7 +3704,7 @@
                     <pic:spPr>
                       <a:xfrm>
                         <a:off x="0" y="0"/>
-                        <a:ext cx="6858000" cy="12700"/>
+                        <a:ext cx="6870700" cy="25400"/>
                       </a:xfrm>
                       <a:prstGeom prst="rect"/>
                       <a:ln/>
@@ -3856,7 +3724,7 @@
             <wp:anchor allowOverlap="1" behindDoc="0" distB="0" distT="0" distL="114300" distR="114300" hidden="0" layoutInCell="1" locked="0" relativeHeight="0" simplePos="0">
               <wp:simplePos x="0" y="0"/>
               <wp:positionH relativeFrom="column">
-                <wp:posOffset>70486</wp:posOffset>
+                <wp:posOffset>70487</wp:posOffset>
               </wp:positionH>
               <wp:positionV relativeFrom="paragraph">
                 <wp:posOffset>163830</wp:posOffset>
@@ -3864,7 +3732,7 @@
               <wp:extent cx="1654810" cy="375285"/>
               <wp:effectExtent b="0" l="0" r="0" t="0"/>
               <wp:wrapNone/>
-              <wp:docPr id="5" name=""/>
+              <wp:docPr id="1" name=""/>
               <a:graphic>
                 <a:graphicData uri="http://schemas.microsoft.com/office/word/2010/wordprocessingGroup">
                   <wpg:wgp>
@@ -3883,17 +3751,17 @@
                         <a:xfrm>
                           <a:off x="4518595" y="3592358"/>
                           <a:ext cx="1654810" cy="375285"/>
-                          <a:chOff x="1916" y="16029"/>
-                          <a:chExt cx="2606" cy="591"/>
+                          <a:chOff x="4518575" y="3592350"/>
+                          <a:chExt cx="1654850" cy="375300"/>
                         </a:xfrm>
                       </wpg:grpSpPr>
                       <wps:wsp>
                         <wps:cNvSpPr/>
-                        <wps:cNvPr id="7" name="Shape 7"/>
+                        <wps:cNvPr id="3" name="Shape 3"/>
                         <wps:spPr>
                           <a:xfrm>
-                            <a:off x="1916" y="16029"/>
-                            <a:ext cx="2600" cy="575"/>
+                            <a:off x="4518575" y="3592350"/>
+                            <a:ext cx="1654850" cy="375300"/>
                           </a:xfrm>
                           <a:prstGeom prst="rect">
                             <a:avLst/>
@@ -3919,110 +3787,153 @@
                           <a:noAutofit/>
                         </wps:bodyPr>
                       </wps:wsp>
-                      <wps:wsp>
-                        <wps:cNvSpPr/>
-                        <wps:cNvPr id="8" name="Shape 8"/>
-                        <wps:spPr>
+                      <wpg:grpSp>
+                        <wpg:cNvGrpSpPr/>
+                        <wpg:grpSpPr>
                           <a:xfrm>
-                            <a:off x="2907" y="16080"/>
-                            <a:ext cx="1615" cy="540"/>
+                            <a:off x="4518595" y="3592358"/>
+                            <a:ext cx="1654810" cy="375285"/>
+                            <a:chOff x="1916" y="16029"/>
+                            <a:chExt cx="2606" cy="591"/>
                           </a:xfrm>
-                          <a:prstGeom prst="rect">
-                            <a:avLst/>
-                          </a:prstGeom>
-                          <a:noFill/>
-                          <a:ln>
+                        </wpg:grpSpPr>
+                        <wps:wsp>
+                          <wps:cNvSpPr/>
+                          <wps:cNvPr id="5" name="Shape 5"/>
+                          <wps:spPr>
+                            <a:xfrm>
+                              <a:off x="1916" y="16029"/>
+                              <a:ext cx="2600" cy="575"/>
+                            </a:xfrm>
+                            <a:prstGeom prst="rect">
+                              <a:avLst/>
+                            </a:prstGeom>
                             <a:noFill/>
-                          </a:ln>
-                        </wps:spPr>
-                        <wps:txbx>
-                          <w:txbxContent>
-                            <w:p>
-                              <w:pPr>
-                                <w:spacing w:after="0" w:before="0" w:line="240"/>
-                                <w:ind w:left="0" w:right="0" w:firstLine="0"/>
-                                <w:jc w:val="left"/>
-                                <w:textDirection w:val="btLr"/>
-                              </w:pPr>
-                            </w:p>
-                            <w:p>
-                              <w:pPr>
-                                <w:spacing w:after="0" w:before="0" w:line="240"/>
-                                <w:ind w:left="0" w:right="0" w:firstLine="0"/>
-                                <w:jc w:val="left"/>
-                                <w:textDirection w:val="btLr"/>
-                              </w:pPr>
-                              <w:r>
-                                <w:rPr>
-                                  <w:rFonts w:ascii="Times New Roman" w:cs="Times New Roman" w:eastAsia="Times New Roman" w:hAnsi="Times New Roman"/>
-                                  <w:b w:val="0"/>
-                                  <w:i w:val="0"/>
-                                  <w:smallCaps w:val="0"/>
-                                  <w:strike w:val="0"/>
-                                  <w:color w:val="000000"/>
-                                  <w:sz w:val="24"/>
-                                  <w:vertAlign w:val="baseline"/>
-                                </w:rPr>
-                              </w:r>
-                            </w:p>
-                          </w:txbxContent>
-                        </wps:txbx>
-                        <wps:bodyPr anchorCtr="0" anchor="t" bIns="45700" lIns="91425" spcFirstLastPara="1" rIns="91425" wrap="square" tIns="45700">
-                          <a:noAutofit/>
-                        </wps:bodyPr>
-                      </wps:wsp>
-                      <wps:wsp>
-                        <wps:cNvSpPr/>
-                        <wps:cNvPr id="9" name="Shape 9"/>
-                        <wps:spPr>
-                          <a:xfrm>
-                            <a:off x="1916" y="16029"/>
-                            <a:ext cx="1232" cy="540"/>
-                          </a:xfrm>
-                          <a:prstGeom prst="rect">
-                            <a:avLst/>
-                          </a:prstGeom>
-                          <a:noFill/>
-                          <a:ln>
+                            <a:ln>
+                              <a:noFill/>
+                            </a:ln>
+                          </wps:spPr>
+                          <wps:txbx>
+                            <w:txbxContent>
+                              <w:p>
+                                <w:pPr>
+                                  <w:spacing w:after="0" w:before="0" w:line="240"/>
+                                  <w:ind w:left="0" w:right="0" w:firstLine="0"/>
+                                  <w:jc w:val="left"/>
+                                  <w:textDirection w:val="btLr"/>
+                                </w:pPr>
+                              </w:p>
+                            </w:txbxContent>
+                          </wps:txbx>
+                          <wps:bodyPr anchorCtr="0" anchor="ctr" bIns="91425" lIns="91425" spcFirstLastPara="1" rIns="91425" wrap="square" tIns="91425">
+                            <a:noAutofit/>
+                          </wps:bodyPr>
+                        </wps:wsp>
+                        <wps:wsp>
+                          <wps:cNvSpPr/>
+                          <wps:cNvPr id="6" name="Shape 6"/>
+                          <wps:spPr>
+                            <a:xfrm>
+                              <a:off x="2907" y="16080"/>
+                              <a:ext cx="1615" cy="540"/>
+                            </a:xfrm>
+                            <a:prstGeom prst="rect">
+                              <a:avLst/>
+                            </a:prstGeom>
                             <a:noFill/>
-                          </a:ln>
-                        </wps:spPr>
-                        <wps:txbx>
-                          <w:txbxContent>
-                            <w:p>
-                              <w:pPr>
-                                <w:spacing w:after="0" w:before="0" w:line="240"/>
-                                <w:ind w:left="0" w:right="0" w:firstLine="0"/>
-                                <w:jc w:val="center"/>
-                                <w:textDirection w:val="btLr"/>
-                              </w:pPr>
-                            </w:p>
-                            <w:p>
-                              <w:pPr>
-                                <w:spacing w:after="0" w:before="0" w:line="240"/>
-                                <w:ind w:left="0" w:right="0" w:firstLine="0"/>
-                                <w:jc w:val="left"/>
-                                <w:textDirection w:val="btLr"/>
-                              </w:pPr>
-                              <w:r>
-                                <w:rPr>
-                                  <w:rFonts w:ascii="Times New Roman" w:cs="Times New Roman" w:eastAsia="Times New Roman" w:hAnsi="Times New Roman"/>
-                                  <w:b w:val="0"/>
-                                  <w:i w:val="0"/>
-                                  <w:smallCaps w:val="0"/>
-                                  <w:strike w:val="0"/>
-                                  <w:color w:val="000000"/>
-                                  <w:sz w:val="24"/>
-                                  <w:vertAlign w:val="baseline"/>
-                                </w:rPr>
-                              </w:r>
-                            </w:p>
-                          </w:txbxContent>
-                        </wps:txbx>
-                        <wps:bodyPr anchorCtr="0" anchor="t" bIns="45700" lIns="91425" spcFirstLastPara="1" rIns="91425" wrap="square" tIns="45700">
-                          <a:noAutofit/>
-                        </wps:bodyPr>
-                      </wps:wsp>
+                            <a:ln>
+                              <a:noFill/>
+                            </a:ln>
+                          </wps:spPr>
+                          <wps:txbx>
+                            <w:txbxContent>
+                              <w:p>
+                                <w:pPr>
+                                  <w:spacing w:after="0" w:before="0" w:line="240"/>
+                                  <w:ind w:left="0" w:right="0" w:firstLine="0"/>
+                                  <w:jc w:val="left"/>
+                                  <w:textDirection w:val="btLr"/>
+                                </w:pPr>
+                              </w:p>
+                              <w:p>
+                                <w:pPr>
+                                  <w:spacing w:after="0" w:before="0" w:line="240"/>
+                                  <w:ind w:left="0" w:right="0" w:firstLine="0"/>
+                                  <w:jc w:val="left"/>
+                                  <w:textDirection w:val="btLr"/>
+                                </w:pPr>
+                                <w:r>
+                                  <w:rPr>
+                                    <w:rFonts w:ascii="Arial" w:cs="Arial" w:eastAsia="Arial" w:hAnsi="Arial"/>
+                                    <w:b w:val="0"/>
+                                    <w:i w:val="0"/>
+                                    <w:smallCaps w:val="0"/>
+                                    <w:strike w:val="0"/>
+                                    <w:color w:val="000000"/>
+                                    <w:sz w:val="28"/>
+                                    <w:vertAlign w:val="baseline"/>
+                                  </w:rPr>
+                                </w:r>
+                              </w:p>
+                            </w:txbxContent>
+                          </wps:txbx>
+                          <wps:bodyPr anchorCtr="0" anchor="t" bIns="45700" lIns="91425" spcFirstLastPara="1" rIns="91425" wrap="square" tIns="45700">
+                            <a:noAutofit/>
+                          </wps:bodyPr>
+                        </wps:wsp>
+                        <wps:wsp>
+                          <wps:cNvSpPr/>
+                          <wps:cNvPr id="7" name="Shape 7"/>
+                          <wps:spPr>
+                            <a:xfrm>
+                              <a:off x="1916" y="16029"/>
+                              <a:ext cx="1232" cy="540"/>
+                            </a:xfrm>
+                            <a:prstGeom prst="rect">
+                              <a:avLst/>
+                            </a:prstGeom>
+                            <a:noFill/>
+                            <a:ln>
+                              <a:noFill/>
+                            </a:ln>
+                          </wps:spPr>
+                          <wps:txbx>
+                            <w:txbxContent>
+                              <w:p>
+                                <w:pPr>
+                                  <w:spacing w:after="0" w:before="0" w:line="240"/>
+                                  <w:ind w:left="0" w:right="0" w:firstLine="0"/>
+                                  <w:jc w:val="center"/>
+                                  <w:textDirection w:val="btLr"/>
+                                </w:pPr>
+                              </w:p>
+                              <w:p>
+                                <w:pPr>
+                                  <w:spacing w:after="0" w:before="0" w:line="240"/>
+                                  <w:ind w:left="0" w:right="0" w:firstLine="0"/>
+                                  <w:jc w:val="left"/>
+                                  <w:textDirection w:val="btLr"/>
+                                </w:pPr>
+                                <w:r>
+                                  <w:rPr>
+                                    <w:rFonts w:ascii="Arial" w:cs="Arial" w:eastAsia="Arial" w:hAnsi="Arial"/>
+                                    <w:b w:val="0"/>
+                                    <w:i w:val="0"/>
+                                    <w:smallCaps w:val="0"/>
+                                    <w:strike w:val="0"/>
+                                    <w:color w:val="000000"/>
+                                    <w:sz w:val="28"/>
+                                    <w:vertAlign w:val="baseline"/>
+                                  </w:rPr>
+                                </w:r>
+                              </w:p>
+                            </w:txbxContent>
+                          </wps:txbx>
+                          <wps:bodyPr anchorCtr="0" anchor="t" bIns="45700" lIns="91425" spcFirstLastPara="1" rIns="91425" wrap="square" tIns="45700">
+                            <a:noAutofit/>
+                          </wps:bodyPr>
+                        </wps:wsp>
+                      </wpg:grpSp>
                     </wpg:grpSp>
                   </wpg:wgp>
                 </a:graphicData>
@@ -4035,7 +3946,7 @@
             <wp:anchor allowOverlap="1" behindDoc="0" distB="0" distT="0" distL="114300" distR="114300" hidden="0" layoutInCell="1" locked="0" relativeHeight="0" simplePos="0">
               <wp:simplePos x="0" y="0"/>
               <wp:positionH relativeFrom="column">
-                <wp:posOffset>70486</wp:posOffset>
+                <wp:posOffset>70487</wp:posOffset>
               </wp:positionH>
               <wp:positionV relativeFrom="paragraph">
                 <wp:posOffset>163830</wp:posOffset>
@@ -4043,12 +3954,12 @@
               <wp:extent cx="1654810" cy="375285"/>
               <wp:effectExtent b="0" l="0" r="0" t="0"/>
               <wp:wrapNone/>
-              <wp:docPr id="5" name="image6.png"/>
+              <wp:docPr id="1" name="image2.png"/>
               <a:graphic>
                 <a:graphicData uri="http://schemas.openxmlformats.org/drawingml/2006/picture">
                   <pic:pic>
                     <pic:nvPicPr>
-                      <pic:cNvPr id="0" name="image6.png"/>
+                      <pic:cNvPr id="0" name="image2.png"/>
                       <pic:cNvPicPr preferRelativeResize="0"/>
                     </pic:nvPicPr>
                     <pic:blipFill>
@@ -4203,6 +4114,108 @@
 </w:ftr>
 </file>
 
+<file path=word/footer2.xml><?xml version="1.0" encoding="utf-8"?>
+<w:ftr xmlns:mc="http://schemas.openxmlformats.org/markup-compatibility/2006" xmlns:o="urn:schemas-microsoft-com:office:office" xmlns:r="http://schemas.openxmlformats.org/officeDocument/2006/relationships" xmlns:m="http://schemas.openxmlformats.org/officeDocument/2006/math" xmlns:v="urn:schemas-microsoft-com:vml" xmlns:wp="http://schemas.openxmlformats.org/drawingml/2006/wordprocessingDrawing" xmlns:w10="urn:schemas-microsoft-com:office:word" xmlns:w="http://schemas.openxmlformats.org/wordprocessingml/2006/main" xmlns:wne="http://schemas.microsoft.com/office/word/2006/wordml" xmlns:sl="http://schemas.openxmlformats.org/schemaLibrary/2006/main" xmlns:a="http://schemas.openxmlformats.org/drawingml/2006/main" xmlns:pic="http://schemas.openxmlformats.org/drawingml/2006/picture" xmlns:c="http://schemas.openxmlformats.org/drawingml/2006/chart" xmlns:lc="http://schemas.openxmlformats.org/drawingml/2006/lockedCanvas" xmlns:dgm="http://schemas.openxmlformats.org/drawingml/2006/diagram" xmlns:wps="http://schemas.microsoft.com/office/word/2010/wordprocessingShape" xmlns:wpg="http://schemas.microsoft.com/office/word/2010/wordprocessingGroup" xmlns:w14="http://schemas.microsoft.com/office/word/2010/wordml" xmlns:w15="http://schemas.microsoft.com/office/word/2012/wordml" xmlns:w16="http://schemas.microsoft.com/office/word/2018/wordml" xmlns:w16cex="http://schemas.microsoft.com/office/word/2018/wordml/cex" xmlns:w16cid="http://schemas.microsoft.com/office/word/2016/wordml/cid" xmlns="http://schemas.microsoft.com/office/tasks/2019/documenttasks" xmlns:cr="http://schemas.microsoft.com/office/comments/2020/reactions">
+  <w:p>
+    <w:pPr>
+      <w:keepNext w:val="0"/>
+      <w:keepLines w:val="0"/>
+      <w:widowControl w:val="1"/>
+      <w:pBdr>
+        <w:top w:space="0" w:sz="0" w:val="nil"/>
+        <w:left w:space="0" w:sz="0" w:val="nil"/>
+        <w:bottom w:space="0" w:sz="0" w:val="nil"/>
+        <w:right w:space="0" w:sz="0" w:val="nil"/>
+        <w:between w:space="0" w:sz="0" w:val="nil"/>
+      </w:pBdr>
+      <w:shd w:fill="auto" w:val="clear"/>
+      <w:spacing w:after="0" w:before="0" w:line="240" w:lineRule="auto"/>
+      <w:ind w:left="0" w:right="0" w:firstLine="0"/>
+      <w:jc w:val="left"/>
+      <w:rPr>
+        <w:rFonts w:ascii="Times New Roman" w:cs="Times New Roman" w:eastAsia="Times New Roman" w:hAnsi="Times New Roman"/>
+        <w:b w:val="0"/>
+        <w:bCs w:val="0"/>
+        <w:i w:val="0"/>
+        <w:iCs w:val="0"/>
+        <w:smallCaps w:val="0"/>
+        <w:strike w:val="0"/>
+        <w:color w:val="000000"/>
+        <w:sz w:val="24"/>
+        <w:szCs w:val="24"/>
+        <w:u w:val="none"/>
+        <w:shd w:fill="auto" w:val="clear"/>
+        <w:vertAlign w:val="baseline"/>
+      </w:rPr>
+    </w:pPr>
+    <w:r>
+      <w:rPr>
+        <w:rFonts w:ascii="Times New Roman" w:cs="Times New Roman" w:eastAsia="Times New Roman" w:hAnsi="Times New Roman"/>
+        <w:b w:val="0"/>
+        <w:bCs w:val="0"/>
+        <w:i w:val="0"/>
+        <w:iCs w:val="0"/>
+        <w:smallCaps w:val="0"/>
+        <w:strike w:val="0"/>
+        <w:color w:val="000000"/>
+        <w:sz w:val="24"/>
+        <w:szCs w:val="24"/>
+        <w:u w:val="none"/>
+        <w:shd w:fill="auto" w:val="clear"/>
+        <w:vertAlign w:val="baseline"/>
+      </w:rPr>
+      <w:fldChar w:fldCharType="begin"/>
+      <w:instrText xml:space="preserve">PAGE</w:instrText>
+      <w:fldChar w:fldCharType="separate"/>
+      <w:fldChar w:fldCharType="end"/>
+    </w:r>
+    <w:r>
+      <w:rPr>
+        <w:rtl w:val="0"/>
+      </w:rPr>
+    </w:r>
+  </w:p>
+  <w:p>
+    <w:pPr>
+      <w:keepNext w:val="0"/>
+      <w:keepLines w:val="0"/>
+      <w:widowControl w:val="1"/>
+      <w:pBdr>
+        <w:top w:space="0" w:sz="0" w:val="nil"/>
+        <w:left w:space="0" w:sz="0" w:val="nil"/>
+        <w:bottom w:space="0" w:sz="0" w:val="nil"/>
+        <w:right w:space="0" w:sz="0" w:val="nil"/>
+        <w:between w:space="0" w:sz="0" w:val="nil"/>
+      </w:pBdr>
+      <w:shd w:fill="auto" w:val="clear"/>
+      <w:spacing w:after="0" w:before="0" w:line="240" w:lineRule="auto"/>
+      <w:ind w:left="0" w:right="0" w:firstLine="360"/>
+      <w:jc w:val="left"/>
+      <w:rPr>
+        <w:rFonts w:ascii="Times New Roman" w:cs="Times New Roman" w:eastAsia="Times New Roman" w:hAnsi="Times New Roman"/>
+        <w:b w:val="0"/>
+        <w:bCs w:val="0"/>
+        <w:i w:val="0"/>
+        <w:iCs w:val="0"/>
+        <w:smallCaps w:val="0"/>
+        <w:strike w:val="0"/>
+        <w:color w:val="000000"/>
+        <w:sz w:val="24"/>
+        <w:szCs w:val="24"/>
+        <w:u w:val="none"/>
+        <w:shd w:fill="auto" w:val="clear"/>
+        <w:vertAlign w:val="baseline"/>
+      </w:rPr>
+    </w:pPr>
+    <w:r>
+      <w:rPr>
+        <w:rtl w:val="0"/>
+      </w:rPr>
+    </w:r>
+  </w:p>
+</w:ftr>
+</file>
+
 <file path=word/header1.xml><?xml version="1.0" encoding="utf-8"?>
 <w:hdr xmlns:mc="http://schemas.openxmlformats.org/markup-compatibility/2006" xmlns:o="urn:schemas-microsoft-com:office:office" xmlns:r="http://schemas.openxmlformats.org/officeDocument/2006/relationships" xmlns:m="http://schemas.openxmlformats.org/officeDocument/2006/math" xmlns:v="urn:schemas-microsoft-com:vml" xmlns:wp="http://schemas.openxmlformats.org/drawingml/2006/wordprocessingDrawing" xmlns:w10="urn:schemas-microsoft-com:office:word" xmlns:w="http://schemas.openxmlformats.org/wordprocessingml/2006/main" xmlns:wne="http://schemas.microsoft.com/office/word/2006/wordml" xmlns:sl="http://schemas.openxmlformats.org/schemaLibrary/2006/main" xmlns:a="http://schemas.openxmlformats.org/drawingml/2006/main" xmlns:pic="http://schemas.openxmlformats.org/drawingml/2006/picture" xmlns:c="http://schemas.openxmlformats.org/drawingml/2006/chart" xmlns:lc="http://schemas.openxmlformats.org/drawingml/2006/lockedCanvas" xmlns:dgm="http://schemas.openxmlformats.org/drawingml/2006/diagram" xmlns:wps="http://schemas.microsoft.com/office/word/2010/wordprocessingShape" xmlns:wpg="http://schemas.microsoft.com/office/word/2010/wordprocessingGroup" xmlns:w14="http://schemas.microsoft.com/office/word/2010/wordml" xmlns:w15="http://schemas.microsoft.com/office/word/2012/wordml" xmlns:w16="http://schemas.microsoft.com/office/word/2018/wordml" xmlns:w16cex="http://schemas.microsoft.com/office/word/2018/wordml/cex" xmlns:w16cid="http://schemas.microsoft.com/office/word/2016/wordml/cid" xmlns="http://schemas.microsoft.com/office/tasks/2019/documenttasks" xmlns:cr="http://schemas.microsoft.com/office/comments/2020/reactions">
   <w:p>
@@ -4238,15 +4251,15 @@
             <wp:anchor allowOverlap="1" behindDoc="0" distB="0" distT="0" distL="114300" distR="114300" hidden="0" layoutInCell="1" locked="0" relativeHeight="0" simplePos="0">
               <wp:simplePos x="0" y="0"/>
               <wp:positionH relativeFrom="column">
-                <wp:posOffset>-733424</wp:posOffset>
+                <wp:posOffset>-738185</wp:posOffset>
               </wp:positionH>
               <wp:positionV relativeFrom="paragraph">
-                <wp:posOffset>-169589</wp:posOffset>
+                <wp:posOffset>-174350</wp:posOffset>
               </wp:positionV>
-              <wp:extent cx="2516505" cy="1457325"/>
+              <wp:extent cx="2526030" cy="1466850"/>
               <wp:effectExtent b="0" l="0" r="0" t="0"/>
               <wp:wrapNone/>
-              <wp:docPr id="6" name=""/>
+              <wp:docPr id="4" name=""/>
               <a:graphic>
                 <a:graphicData uri="http://schemas.microsoft.com/office/word/2010/wordprocessingShape">
                   <wps:wsp>
@@ -4300,7 +4313,7 @@
                           <w:r>
                             <w:rPr>
                               <w:rFonts w:ascii="Times New Roman" w:cs="Times New Roman" w:eastAsia="Times New Roman" w:hAnsi="Times New Roman"/>
-                              <w:b w:val="0"/>
+                              <w:b w:val="1"/>
                               <w:i w:val="0"/>
                               <w:smallCaps w:val="0"/>
                               <w:strike w:val="0"/>
@@ -4334,7 +4347,7 @@
                           <w:r>
                             <w:rPr>
                               <w:rFonts w:ascii="Times New Roman" w:cs="Times New Roman" w:eastAsia="Times New Roman" w:hAnsi="Times New Roman"/>
-                              <w:b w:val="0"/>
+                              <w:b w:val="1"/>
                               <w:i w:val="0"/>
                               <w:smallCaps w:val="0"/>
                               <w:strike w:val="0"/>
@@ -4368,7 +4381,7 @@
                           <w:r>
                             <w:rPr>
                               <w:rFonts w:ascii="Times New Roman" w:cs="Times New Roman" w:eastAsia="Times New Roman" w:hAnsi="Times New Roman"/>
-                              <w:b w:val="0"/>
+                              <w:b w:val="1"/>
                               <w:i w:val="0"/>
                               <w:smallCaps w:val="0"/>
                               <w:strike w:val="0"/>
@@ -4407,7 +4420,7 @@
                               <w:smallCaps w:val="0"/>
                               <w:strike w:val="0"/>
                               <w:color w:val="000000"/>
-                              <w:sz w:val="28"/>
+                              <w:sz w:val="26"/>
                               <w:vertAlign w:val="baseline"/>
                             </w:rPr>
                           </w:r>
@@ -4495,20 +4508,20 @@
             <wp:anchor allowOverlap="1" behindDoc="0" distB="0" distT="0" distL="114300" distR="114300" hidden="0" layoutInCell="1" locked="0" relativeHeight="0" simplePos="0">
               <wp:simplePos x="0" y="0"/>
               <wp:positionH relativeFrom="column">
-                <wp:posOffset>-733424</wp:posOffset>
+                <wp:posOffset>-738185</wp:posOffset>
               </wp:positionH>
               <wp:positionV relativeFrom="paragraph">
-                <wp:posOffset>-169589</wp:posOffset>
+                <wp:posOffset>-174350</wp:posOffset>
               </wp:positionV>
-              <wp:extent cx="2516505" cy="1457325"/>
+              <wp:extent cx="2526030" cy="1466850"/>
               <wp:effectExtent b="0" l="0" r="0" t="0"/>
               <wp:wrapNone/>
-              <wp:docPr id="6" name="image7.png"/>
+              <wp:docPr id="4" name="image5.png"/>
               <a:graphic>
                 <a:graphicData uri="http://schemas.openxmlformats.org/drawingml/2006/picture">
                   <pic:pic>
                     <pic:nvPicPr>
-                      <pic:cNvPr id="0" name="image7.png"/>
+                      <pic:cNvPr id="0" name="image5.png"/>
                       <pic:cNvPicPr preferRelativeResize="0"/>
                     </pic:nvPicPr>
                     <pic:blipFill>
@@ -4521,7 +4534,7 @@
                     <pic:spPr>
                       <a:xfrm>
                         <a:off x="0" y="0"/>
-                        <a:ext cx="2516505" cy="1457325"/>
+                        <a:ext cx="2526030" cy="1466850"/>
                       </a:xfrm>
                       <a:prstGeom prst="rect"/>
                       <a:ln/>
@@ -4541,12 +4554,12 @@
             <wp:anchor allowOverlap="1" behindDoc="0" distB="0" distT="0" distL="114300" distR="114300" hidden="0" layoutInCell="1" locked="0" relativeHeight="0" simplePos="0">
               <wp:simplePos x="0" y="0"/>
               <wp:positionH relativeFrom="column">
-                <wp:posOffset>4305300</wp:posOffset>
+                <wp:posOffset>4300538</wp:posOffset>
               </wp:positionH>
               <wp:positionV relativeFrom="paragraph">
-                <wp:posOffset>-190499</wp:posOffset>
+                <wp:posOffset>-195259</wp:posOffset>
               </wp:positionV>
-              <wp:extent cx="3011170" cy="1475105"/>
+              <wp:extent cx="3020695" cy="1484630"/>
               <wp:effectExtent b="0" l="0" r="0" t="0"/>
               <wp:wrapNone/>
               <wp:docPr id="3" name=""/>
@@ -4554,7 +4567,7 @@
                 <a:graphicData uri="http://schemas.microsoft.com/office/word/2010/wordprocessingShape">
                   <wps:wsp>
                     <wps:cNvSpPr/>
-                    <wps:cNvPr id="4" name="Shape 4"/>
+                    <wps:cNvPr id="9" name="Shape 9"/>
                     <wps:spPr>
                       <a:xfrm>
                         <a:off x="3845178" y="3047210"/>
@@ -4603,7 +4616,7 @@
                           <w:r>
                             <w:rPr>
                               <w:rFonts w:ascii="Times New Roman" w:cs="Times New Roman" w:eastAsia="Times New Roman" w:hAnsi="Times New Roman"/>
-                              <w:b w:val="0"/>
+                              <w:b w:val="1"/>
                               <w:i w:val="0"/>
                               <w:smallCaps w:val="0"/>
                               <w:strike w:val="0"/>
@@ -4637,7 +4650,7 @@
                           <w:r>
                             <w:rPr>
                               <w:rFonts w:ascii="Times New Roman" w:cs="Times New Roman" w:eastAsia="Times New Roman" w:hAnsi="Times New Roman"/>
-                              <w:b w:val="0"/>
+                              <w:b w:val="1"/>
                               <w:i w:val="0"/>
                               <w:smallCaps w:val="0"/>
                               <w:strike w:val="0"/>
@@ -4671,7 +4684,7 @@
                           <w:r>
                             <w:rPr>
                               <w:rFonts w:ascii="Times New Roman" w:cs="Times New Roman" w:eastAsia="Times New Roman" w:hAnsi="Times New Roman"/>
-                              <w:b w:val="0"/>
+                              <w:b w:val="1"/>
                               <w:i w:val="0"/>
                               <w:smallCaps w:val="0"/>
                               <w:strike w:val="0"/>
@@ -4704,13 +4717,13 @@
                           </w:pPr>
                           <w:r>
                             <w:rPr>
-                              <w:rFonts w:ascii="Arial" w:cs="Arial" w:eastAsia="Arial" w:hAnsi="Arial"/>
+                              <w:rFonts w:ascii="Times New Roman" w:cs="Times New Roman" w:eastAsia="Times New Roman" w:hAnsi="Times New Roman"/>
                               <w:b w:val="1"/>
                               <w:i w:val="0"/>
                               <w:smallCaps w:val="0"/>
                               <w:strike w:val="0"/>
                               <w:color w:val="000000"/>
-                              <w:sz w:val="24"/>
+                              <w:sz w:val="26"/>
                               <w:vertAlign w:val="baseline"/>
                             </w:rPr>
                           </w:r>
@@ -4798,12 +4811,12 @@
             <wp:anchor allowOverlap="1" behindDoc="0" distB="0" distT="0" distL="114300" distR="114300" hidden="0" layoutInCell="1" locked="0" relativeHeight="0" simplePos="0">
               <wp:simplePos x="0" y="0"/>
               <wp:positionH relativeFrom="column">
-                <wp:posOffset>4305300</wp:posOffset>
+                <wp:posOffset>4300538</wp:posOffset>
               </wp:positionH>
               <wp:positionV relativeFrom="paragraph">
-                <wp:posOffset>-190499</wp:posOffset>
+                <wp:posOffset>-195259</wp:posOffset>
               </wp:positionV>
-              <wp:extent cx="3011170" cy="1475105"/>
+              <wp:extent cx="3020695" cy="1484630"/>
               <wp:effectExtent b="0" l="0" r="0" t="0"/>
               <wp:wrapNone/>
               <wp:docPr id="3" name="image4.png"/>
@@ -4824,7 +4837,112 @@
                     <pic:spPr>
                       <a:xfrm>
                         <a:off x="0" y="0"/>
-                        <a:ext cx="3011170" cy="1475105"/>
+                        <a:ext cx="3020695" cy="1484630"/>
+                      </a:xfrm>
+                      <a:prstGeom prst="rect"/>
+                      <a:ln/>
+                    </pic:spPr>
+                  </pic:pic>
+                </a:graphicData>
+              </a:graphic>
+            </wp:anchor>
+          </w:drawing>
+        </mc:Fallback>
+      </mc:AlternateContent>
+    </w:r>
+    <w:r>
+      <mc:AlternateContent>
+        <mc:Choice Requires="wpg">
+          <w:drawing>
+            <wp:anchor allowOverlap="1" behindDoc="0" distB="0" distT="0" distL="114300" distR="114300" hidden="0" layoutInCell="1" locked="0" relativeHeight="0" simplePos="0">
+              <wp:simplePos x="0" y="0"/>
+              <wp:positionH relativeFrom="column">
+                <wp:posOffset>-407986</wp:posOffset>
+              </wp:positionH>
+              <wp:positionV relativeFrom="paragraph">
+                <wp:posOffset>-346073</wp:posOffset>
+              </wp:positionV>
+              <wp:extent cx="7273925" cy="1482725"/>
+              <wp:effectExtent b="0" l="0" r="0" t="0"/>
+              <wp:wrapNone/>
+              <wp:docPr id="6" name=""/>
+              <a:graphic>
+                <a:graphicData uri="http://schemas.microsoft.com/office/word/2010/wordprocessingShape">
+                  <wps:wsp>
+                    <wps:cNvSpPr/>
+                    <wps:cNvPr id="12" name="Shape 12"/>
+                    <wps:spPr>
+                      <a:xfrm>
+                        <a:off x="1993200" y="3041178"/>
+                        <a:ext cx="6705600" cy="1477645"/>
+                      </a:xfrm>
+                      <a:prstGeom prst="rect">
+                        <a:avLst/>
+                      </a:prstGeom>
+                      <a:noFill/>
+                      <a:ln cap="flat" cmpd="dbl" w="25400">
+                        <a:solidFill>
+                          <a:srgbClr val="000000"/>
+                        </a:solidFill>
+                        <a:prstDash val="solid"/>
+                        <a:miter lim="80"/>
+                        <a:headEnd len="sm" w="sm" type="none"/>
+                        <a:tailEnd len="sm" w="sm" type="none"/>
+                      </a:ln>
+                    </wps:spPr>
+                    <wps:txbx>
+                      <w:txbxContent>
+                        <w:p>
+                          <w:pPr>
+                            <w:spacing w:after="0" w:before="0" w:line="240"/>
+                            <w:ind w:left="0" w:right="0" w:firstLine="0"/>
+                            <w:jc w:val="left"/>
+                            <w:textDirection w:val="btLr"/>
+                          </w:pPr>
+                        </w:p>
+                      </w:txbxContent>
+                    </wps:txbx>
+                    <wps:bodyPr anchorCtr="0" anchor="ctr" bIns="91425" lIns="91425" spcFirstLastPara="1" rIns="91425" wrap="square" tIns="91425">
+                      <a:noAutofit/>
+                    </wps:bodyPr>
+                  </wps:wsp>
+                </a:graphicData>
+              </a:graphic>
+            </wp:anchor>
+          </w:drawing>
+        </mc:Choice>
+        <mc:Fallback>
+          <w:drawing>
+            <wp:anchor allowOverlap="1" behindDoc="0" distB="0" distT="0" distL="114300" distR="114300" hidden="0" layoutInCell="1" locked="0" relativeHeight="0" simplePos="0">
+              <wp:simplePos x="0" y="0"/>
+              <wp:positionH relativeFrom="column">
+                <wp:posOffset>-407986</wp:posOffset>
+              </wp:positionH>
+              <wp:positionV relativeFrom="paragraph">
+                <wp:posOffset>-346073</wp:posOffset>
+              </wp:positionV>
+              <wp:extent cx="7273925" cy="1482725"/>
+              <wp:effectExtent b="0" l="0" r="0" t="0"/>
+              <wp:wrapNone/>
+              <wp:docPr id="6" name="image7.png"/>
+              <a:graphic>
+                <a:graphicData uri="http://schemas.openxmlformats.org/drawingml/2006/picture">
+                  <pic:pic>
+                    <pic:nvPicPr>
+                      <pic:cNvPr id="0" name="image7.png"/>
+                      <pic:cNvPicPr preferRelativeResize="0"/>
+                    </pic:nvPicPr>
+                    <pic:blipFill>
+                      <a:blip r:embed="rId1"/>
+                      <a:srcRect/>
+                      <a:stretch>
+                        <a:fillRect/>
+                      </a:stretch>
+                    </pic:blipFill>
+                    <pic:spPr>
+                      <a:xfrm>
+                        <a:off x="0" y="0"/>
+                        <a:ext cx="7273925" cy="1482725"/>
                       </a:xfrm>
                       <a:prstGeom prst="rect"/>
                       <a:ln/>
@@ -4845,7 +4963,7 @@
             <wp:posOffset>2686050</wp:posOffset>
           </wp:positionH>
           <wp:positionV relativeFrom="paragraph">
-            <wp:posOffset>-285749</wp:posOffset>
+            <wp:posOffset>-285748</wp:posOffset>
           </wp:positionV>
           <wp:extent cx="844074" cy="790197"/>
           <wp:effectExtent b="0" l="0" r="0" t="0"/>
@@ -4879,111 +4997,6 @@
         </wp:anchor>
       </w:drawing>
     </w:r>
-    <w:r>
-      <mc:AlternateContent>
-        <mc:Choice Requires="wpg">
-          <w:drawing>
-            <wp:anchor allowOverlap="1" behindDoc="0" distB="0" distT="0" distL="114300" distR="114300" hidden="0" layoutInCell="1" locked="0" relativeHeight="0" simplePos="0">
-              <wp:simplePos x="0" y="0"/>
-              <wp:positionH relativeFrom="column">
-                <wp:posOffset>-395287</wp:posOffset>
-              </wp:positionH>
-              <wp:positionV relativeFrom="paragraph">
-                <wp:posOffset>-333374</wp:posOffset>
-              </wp:positionV>
-              <wp:extent cx="7248525" cy="1457325"/>
-              <wp:effectExtent b="0" l="0" r="0" t="0"/>
-              <wp:wrapNone/>
-              <wp:docPr id="1" name=""/>
-              <a:graphic>
-                <a:graphicData uri="http://schemas.microsoft.com/office/word/2010/wordprocessingShape">
-                  <wps:wsp>
-                    <wps:cNvSpPr/>
-                    <wps:cNvPr id="2" name="Shape 2"/>
-                    <wps:spPr>
-                      <a:xfrm>
-                        <a:off x="1993200" y="3041178"/>
-                        <a:ext cx="6705600" cy="1477645"/>
-                      </a:xfrm>
-                      <a:prstGeom prst="rect">
-                        <a:avLst/>
-                      </a:prstGeom>
-                      <a:noFill/>
-                      <a:ln cap="flat" cmpd="dbl" w="25400">
-                        <a:solidFill>
-                          <a:srgbClr val="000000"/>
-                        </a:solidFill>
-                        <a:prstDash val="solid"/>
-                        <a:miter lim="8000"/>
-                        <a:headEnd len="sm" w="sm" type="none"/>
-                        <a:tailEnd len="sm" w="sm" type="none"/>
-                      </a:ln>
-                    </wps:spPr>
-                    <wps:txbx>
-                      <w:txbxContent>
-                        <w:p>
-                          <w:pPr>
-                            <w:spacing w:after="0" w:before="0" w:line="240"/>
-                            <w:ind w:left="0" w:right="0" w:firstLine="0"/>
-                            <w:jc w:val="left"/>
-                            <w:textDirection w:val="btLr"/>
-                          </w:pPr>
-                        </w:p>
-                      </w:txbxContent>
-                    </wps:txbx>
-                    <wps:bodyPr anchorCtr="0" anchor="ctr" bIns="91425" lIns="91425" spcFirstLastPara="1" rIns="91425" wrap="square" tIns="91425">
-                      <a:noAutofit/>
-                    </wps:bodyPr>
-                  </wps:wsp>
-                </a:graphicData>
-              </a:graphic>
-            </wp:anchor>
-          </w:drawing>
-        </mc:Choice>
-        <mc:Fallback>
-          <w:drawing>
-            <wp:anchor allowOverlap="1" behindDoc="0" distB="0" distT="0" distL="114300" distR="114300" hidden="0" layoutInCell="1" locked="0" relativeHeight="0" simplePos="0">
-              <wp:simplePos x="0" y="0"/>
-              <wp:positionH relativeFrom="column">
-                <wp:posOffset>-395287</wp:posOffset>
-              </wp:positionH>
-              <wp:positionV relativeFrom="paragraph">
-                <wp:posOffset>-333374</wp:posOffset>
-              </wp:positionV>
-              <wp:extent cx="7248525" cy="1457325"/>
-              <wp:effectExtent b="0" l="0" r="0" t="0"/>
-              <wp:wrapNone/>
-              <wp:docPr id="1" name="image2.png"/>
-              <a:graphic>
-                <a:graphicData uri="http://schemas.openxmlformats.org/drawingml/2006/picture">
-                  <pic:pic>
-                    <pic:nvPicPr>
-                      <pic:cNvPr id="0" name="image2.png"/>
-                      <pic:cNvPicPr preferRelativeResize="0"/>
-                    </pic:nvPicPr>
-                    <pic:blipFill>
-                      <a:blip r:embed="rId1"/>
-                      <a:srcRect/>
-                      <a:stretch>
-                        <a:fillRect/>
-                      </a:stretch>
-                    </pic:blipFill>
-                    <pic:spPr>
-                      <a:xfrm>
-                        <a:off x="0" y="0"/>
-                        <a:ext cx="7248525" cy="1457325"/>
-                      </a:xfrm>
-                      <a:prstGeom prst="rect"/>
-                      <a:ln/>
-                    </pic:spPr>
-                  </pic:pic>
-                </a:graphicData>
-              </a:graphic>
-            </wp:anchor>
-          </w:drawing>
-        </mc:Fallback>
-      </mc:AlternateContent>
-    </w:r>
   </w:p>
   <w:p>
     <w:pPr>
@@ -5011,20 +5024,20 @@
             <wp:anchor allowOverlap="1" behindDoc="0" distB="0" distT="0" distL="114300" distR="114300" hidden="0" layoutInCell="1" locked="0" relativeHeight="0" simplePos="0">
               <wp:simplePos x="0" y="0"/>
               <wp:positionH relativeFrom="column">
-                <wp:posOffset>1781175</wp:posOffset>
+                <wp:posOffset>1776413</wp:posOffset>
               </wp:positionH>
               <wp:positionV relativeFrom="paragraph">
-                <wp:posOffset>154335</wp:posOffset>
+                <wp:posOffset>149572</wp:posOffset>
               </wp:positionV>
-              <wp:extent cx="2657475" cy="712470"/>
+              <wp:extent cx="2667000" cy="721995"/>
               <wp:effectExtent b="0" l="0" r="0" t="0"/>
               <wp:wrapNone/>
-              <wp:docPr id="2" name=""/>
+              <wp:docPr id="5" name=""/>
               <a:graphic>
                 <a:graphicData uri="http://schemas.microsoft.com/office/word/2010/wordprocessingShape">
                   <wps:wsp>
                     <wps:cNvSpPr/>
-                    <wps:cNvPr id="3" name="Shape 3"/>
+                    <wps:cNvPr id="11" name="Shape 11"/>
                     <wps:spPr>
                       <a:xfrm>
                         <a:off x="4022025" y="3428528"/>
@@ -5170,7 +5183,7 @@
                           <w:r>
                             <w:rPr>
                               <w:rFonts w:ascii="Times New Roman" w:cs="Times New Roman" w:eastAsia="Times New Roman" w:hAnsi="Times New Roman"/>
-                              <w:b w:val="0"/>
+                              <w:b w:val="1"/>
                               <w:i w:val="0"/>
                               <w:smallCaps w:val="0"/>
                               <w:strike w:val="0"/>
@@ -5196,20 +5209,20 @@
             <wp:anchor allowOverlap="1" behindDoc="0" distB="0" distT="0" distL="114300" distR="114300" hidden="0" layoutInCell="1" locked="0" relativeHeight="0" simplePos="0">
               <wp:simplePos x="0" y="0"/>
               <wp:positionH relativeFrom="column">
-                <wp:posOffset>1781175</wp:posOffset>
+                <wp:posOffset>1776413</wp:posOffset>
               </wp:positionH>
               <wp:positionV relativeFrom="paragraph">
-                <wp:posOffset>154335</wp:posOffset>
+                <wp:posOffset>149572</wp:posOffset>
               </wp:positionV>
-              <wp:extent cx="2657475" cy="712470"/>
+              <wp:extent cx="2667000" cy="721995"/>
               <wp:effectExtent b="0" l="0" r="0" t="0"/>
               <wp:wrapNone/>
-              <wp:docPr id="2" name="image3.png"/>
+              <wp:docPr id="5" name="image6.png"/>
               <a:graphic>
                 <a:graphicData uri="http://schemas.openxmlformats.org/drawingml/2006/picture">
                   <pic:pic>
                     <pic:nvPicPr>
-                      <pic:cNvPr id="0" name="image3.png"/>
+                      <pic:cNvPr id="0" name="image6.png"/>
                       <pic:cNvPicPr preferRelativeResize="0"/>
                     </pic:nvPicPr>
                     <pic:blipFill>
@@ -5222,7 +5235,7 @@
                     <pic:spPr>
                       <a:xfrm>
                         <a:off x="0" y="0"/>
-                        <a:ext cx="2657475" cy="712470"/>
+                        <a:ext cx="2667000" cy="721995"/>
                       </a:xfrm>
                       <a:prstGeom prst="rect"/>
                       <a:ln/>
@@ -5645,13 +5658,6 @@
       <w:tblStyleColBandSize w:val="1"/>
     </w:tblPr>
   </w:style>
-  <w:style w:type="table" w:styleId="Table2">
-    <w:basedOn w:val="TableNormal"/>
-    <w:tblPr>
-      <w:tblStyleRowBandSize w:val="1"/>
-      <w:tblStyleColBandSize w:val="1"/>
-    </w:tblPr>
-  </w:style>
 </w:styles>
 </file>
 

</xml_diff>

<commit_message>
docs: fit the letterhead's last line inside its border and centre the table bodies
</commit_message>
<xml_diff>
--- a/docs/list.docx
+++ b/docs/list.docx
@@ -3193,6 +3193,7 @@
           <w:p>
             <w:pPr>
               <w:widowControl w:val="0"/>
+              <w:jc w:val="center"/>
               <w:rPr>
                 <w:rFonts w:ascii="Noto Naskh Arabic" w:cs="Noto Naskh Arabic" w:eastAsia="Noto Naskh Arabic" w:hAnsi="Noto Naskh Arabic"/>
                 <w:sz w:val="20"/>
@@ -3215,6 +3216,7 @@
           <w:p>
             <w:pPr>
               <w:widowControl w:val="0"/>
+              <w:jc w:val="center"/>
               <w:rPr>
                 <w:rFonts w:ascii="Noto Naskh Arabic" w:cs="Noto Naskh Arabic" w:eastAsia="Noto Naskh Arabic" w:hAnsi="Noto Naskh Arabic"/>
                 <w:sz w:val="20"/>
@@ -3237,6 +3239,7 @@
           <w:p>
             <w:pPr>
               <w:widowControl w:val="0"/>
+              <w:jc w:val="center"/>
               <w:rPr>
                 <w:rFonts w:ascii="Noto Naskh Arabic" w:cs="Noto Naskh Arabic" w:eastAsia="Noto Naskh Arabic" w:hAnsi="Noto Naskh Arabic"/>
                 <w:sz w:val="20"/>
@@ -3259,6 +3262,7 @@
           <w:p>
             <w:pPr>
               <w:widowControl w:val="0"/>
+              <w:jc w:val="center"/>
               <w:rPr>
                 <w:rFonts w:ascii="Noto Naskh Arabic" w:cs="Noto Naskh Arabic" w:eastAsia="Noto Naskh Arabic" w:hAnsi="Noto Naskh Arabic"/>
                 <w:sz w:val="20"/>
@@ -3281,6 +3285,7 @@
           <w:p>
             <w:pPr>
               <w:widowControl w:val="0"/>
+              <w:jc w:val="center"/>
               <w:rPr>
                 <w:rFonts w:ascii="Noto Naskh Arabic" w:cs="Noto Naskh Arabic" w:eastAsia="Noto Naskh Arabic" w:hAnsi="Noto Naskh Arabic"/>
                 <w:sz w:val="20"/>
@@ -3303,6 +3308,7 @@
           <w:p>
             <w:pPr>
               <w:widowControl w:val="0"/>
+              <w:jc w:val="center"/>
               <w:rPr>
                 <w:rFonts w:ascii="Noto Naskh Arabic" w:cs="Noto Naskh Arabic" w:eastAsia="Noto Naskh Arabic" w:hAnsi="Noto Naskh Arabic"/>
                 <w:sz w:val="20"/>
@@ -3326,6 +3332,7 @@
             <w:pPr>
               <w:widowControl w:val="0"/>
               <w:bidi w:val="1"/>
+              <w:jc w:val="center"/>
               <w:rPr>
                 <w:rFonts w:ascii="Noto Naskh Arabic" w:cs="Noto Naskh Arabic" w:eastAsia="Noto Naskh Arabic" w:hAnsi="Noto Naskh Arabic"/>
                 <w:sz w:val="20"/>
@@ -5027,7 +5034,7 @@
                 <wp:posOffset>1776413</wp:posOffset>
               </wp:positionH>
               <wp:positionV relativeFrom="paragraph">
-                <wp:posOffset>149572</wp:posOffset>
+                <wp:posOffset>47972</wp:posOffset>
               </wp:positionV>
               <wp:extent cx="2667000" cy="721995"/>
               <wp:effectExtent b="0" l="0" r="0" t="0"/>
@@ -5167,7 +5174,7 @@
                               <w:smallCaps w:val="0"/>
                               <w:strike w:val="0"/>
                               <w:color w:val="000000"/>
-                              <w:sz w:val="24"/>
+                              <w:sz w:val="20"/>
                               <w:vertAlign w:val="baseline"/>
                             </w:rPr>
                             <w:t xml:space="preserve">Slemani Municipality Presidency</w:t>

</xml_diff>